<commit_message>
Creation MD files for instructions - The end
</commit_message>
<xml_diff>
--- a/org.bpy.electronics.mc6809.help/html/hover/utils/Pictures.docx
+++ b/org.bpy.electronics.mc6809.help/html/hover/utils/Pictures.docx
@@ -7,8 +7,8 @@
         <mc:AlternateContent>
           <mc:Choice Requires="wpc">
             <w:drawing>
-              <wp:inline distT="0" distB="0" distL="0" distR="0" wp14:anchorId="1D31CDC9" wp14:editId="7E0F4F08">
-                <wp:extent cx="5486400" cy="3200400"/>
+              <wp:inline distT="0" distB="0" distL="0" distR="0" wp14:anchorId="1D31CDC9" wp14:editId="57AF2BE5">
+                <wp:extent cx="5486400" cy="5905500"/>
                 <wp:effectExtent l="0" t="0" r="0" b="0"/>
                 <wp:docPr id="1124187988" name="Zone de dessin 2"/>
                 <wp:cNvGraphicFramePr>
@@ -7766,6 +7766,1645 @@
                           <wps:bodyPr/>
                         </wps:wsp>
                       </wpg:wgp>
+                      <wpg:wgp>
+                        <wpg:cNvPr id="1270731583" name="Groupe 1270731583"/>
+                        <wpg:cNvGrpSpPr/>
+                        <wpg:grpSpPr>
+                          <a:xfrm>
+                            <a:off x="426912" y="2923200"/>
+                            <a:ext cx="922057" cy="485140"/>
+                            <a:chOff x="426912" y="2923200"/>
+                            <a:chExt cx="922057" cy="485140"/>
+                          </a:xfrm>
+                        </wpg:grpSpPr>
+                        <wps:wsp>
+                          <wps:cNvPr id="1807484047" name="Zone de texte 1"/>
+                          <wps:cNvSpPr txBox="1"/>
+                          <wps:spPr>
+                            <a:xfrm>
+                              <a:off x="454505" y="3133216"/>
+                              <a:ext cx="107962" cy="107845"/>
+                            </a:xfrm>
+                            <a:prstGeom prst="rect">
+                              <a:avLst/>
+                            </a:prstGeom>
+                            <a:solidFill>
+                              <a:schemeClr val="lt1"/>
+                            </a:solidFill>
+                            <a:ln w="6350">
+                              <a:solidFill>
+                                <a:prstClr val="black"/>
+                              </a:solidFill>
+                            </a:ln>
+                          </wps:spPr>
+                          <wps:txbx>
+                            <w:txbxContent>
+                              <w:p>
+                                <w:pPr>
+                                  <w:spacing w:line="252" w:lineRule="auto"/>
+                                  <w:jc w:val="center"/>
+                                  <w:rPr>
+                                    <w:rFonts w:ascii="Calibri" w:eastAsia="Calibri" w:hAnsi="Calibri"/>
+                                    <w:b/>
+                                    <w:bCs/>
+                                    <w:shadow/>
+                                    <w:color w:val="000000"/>
+                                    <w14:shadow w14:blurRad="38100" w14:dist="19050" w14:dir="2700000" w14:sx="100000" w14:sy="100000" w14:kx="0" w14:ky="0" w14:algn="tl">
+                                      <w14:schemeClr w14:val="dk1">
+                                        <w14:alpha w14:val="60000"/>
+                                      </w14:schemeClr>
+                                    </w14:shadow>
+                                    <w14:ligatures w14:val="none"/>
+                                  </w:rPr>
+                                </w:pPr>
+                                <w:r>
+                                  <w:rPr>
+                                    <w:rFonts w:ascii="Calibri" w:eastAsia="Calibri" w:hAnsi="Calibri"/>
+                                    <w:b/>
+                                    <w:bCs/>
+                                    <w:shadow/>
+                                    <w:color w:val="000000"/>
+                                    <w14:shadow w14:blurRad="38100" w14:dist="19050" w14:dir="2700000" w14:sx="100000" w14:sy="100000" w14:kx="0" w14:ky="0" w14:algn="tl">
+                                      <w14:schemeClr w14:val="dk1">
+                                        <w14:alpha w14:val="60000"/>
+                                      </w14:schemeClr>
+                                    </w14:shadow>
+                                  </w:rPr>
+                                  <w:t> </w:t>
+                                </w:r>
+                              </w:p>
+                            </w:txbxContent>
+                          </wps:txbx>
+                          <wps:bodyPr rot="0" spcFirstLastPara="0" vert="horz" wrap="square" lIns="0" tIns="36000" rIns="0" bIns="36000" numCol="1" spcCol="0" rtlCol="0" fromWordArt="0" anchor="ctr" anchorCtr="0" forceAA="0" compatLnSpc="1">
+                            <a:prstTxWarp prst="textNoShape">
+                              <a:avLst/>
+                            </a:prstTxWarp>
+                            <a:noAutofit/>
+                          </wps:bodyPr>
+                        </wps:wsp>
+                        <wps:wsp>
+                          <wps:cNvPr id="553787670" name="Zone de texte 1"/>
+                          <wps:cNvSpPr txBox="1"/>
+                          <wps:spPr>
+                            <a:xfrm>
+                              <a:off x="561711" y="3133216"/>
+                              <a:ext cx="107912" cy="107795"/>
+                            </a:xfrm>
+                            <a:prstGeom prst="rect">
+                              <a:avLst/>
+                            </a:prstGeom>
+                            <a:solidFill>
+                              <a:schemeClr val="lt1"/>
+                            </a:solidFill>
+                            <a:ln w="6350">
+                              <a:solidFill>
+                                <a:prstClr val="black"/>
+                              </a:solidFill>
+                            </a:ln>
+                          </wps:spPr>
+                          <wps:txbx>
+                            <w:txbxContent>
+                              <w:p>
+                                <w:pPr>
+                                  <w:spacing w:line="252" w:lineRule="auto"/>
+                                  <w:jc w:val="center"/>
+                                  <w:rPr>
+                                    <w:rFonts w:ascii="Calibri" w:eastAsia="Calibri" w:hAnsi="Calibri"/>
+                                    <w:b/>
+                                    <w:bCs/>
+                                    <w:shadow/>
+                                    <w:color w:val="000000"/>
+                                    <w14:shadow w14:blurRad="38100" w14:dist="19050" w14:dir="2700000" w14:sx="100000" w14:sy="100000" w14:kx="0" w14:ky="0" w14:algn="tl">
+                                      <w14:schemeClr w14:val="dk1">
+                                        <w14:alpha w14:val="60000"/>
+                                      </w14:schemeClr>
+                                    </w14:shadow>
+                                    <w14:ligatures w14:val="none"/>
+                                  </w:rPr>
+                                </w:pPr>
+                                <w:r>
+                                  <w:rPr>
+                                    <w:rFonts w:ascii="Calibri" w:eastAsia="Calibri" w:hAnsi="Calibri"/>
+                                    <w:b/>
+                                    <w:bCs/>
+                                    <w:shadow/>
+                                    <w:color w:val="000000"/>
+                                    <w14:shadow w14:blurRad="38100" w14:dist="19050" w14:dir="2700000" w14:sx="100000" w14:sy="100000" w14:kx="0" w14:ky="0" w14:algn="tl">
+                                      <w14:schemeClr w14:val="dk1">
+                                        <w14:alpha w14:val="60000"/>
+                                      </w14:schemeClr>
+                                    </w14:shadow>
+                                  </w:rPr>
+                                  <w:t> </w:t>
+                                </w:r>
+                              </w:p>
+                            </w:txbxContent>
+                          </wps:txbx>
+                          <wps:bodyPr rot="0" spcFirstLastPara="0" vert="horz" wrap="square" lIns="0" tIns="36000" rIns="0" bIns="36000" numCol="1" spcCol="0" rtlCol="0" fromWordArt="0" anchor="ctr" anchorCtr="0" forceAA="0" compatLnSpc="1">
+                            <a:prstTxWarp prst="textNoShape">
+                              <a:avLst/>
+                            </a:prstTxWarp>
+                            <a:noAutofit/>
+                          </wps:bodyPr>
+                        </wps:wsp>
+                        <wps:wsp>
+                          <wps:cNvPr id="177682262" name="Zone de texte 1"/>
+                          <wps:cNvSpPr txBox="1"/>
+                          <wps:spPr>
+                            <a:xfrm>
+                              <a:off x="668918" y="3133216"/>
+                              <a:ext cx="107912" cy="107795"/>
+                            </a:xfrm>
+                            <a:prstGeom prst="rect">
+                              <a:avLst/>
+                            </a:prstGeom>
+                            <a:solidFill>
+                              <a:schemeClr val="lt1"/>
+                            </a:solidFill>
+                            <a:ln w="6350">
+                              <a:solidFill>
+                                <a:prstClr val="black"/>
+                              </a:solidFill>
+                            </a:ln>
+                          </wps:spPr>
+                          <wps:txbx>
+                            <w:txbxContent>
+                              <w:p>
+                                <w:pPr>
+                                  <w:spacing w:line="252" w:lineRule="auto"/>
+                                  <w:jc w:val="center"/>
+                                  <w:rPr>
+                                    <w:rFonts w:ascii="Calibri" w:eastAsia="Calibri" w:hAnsi="Calibri"/>
+                                    <w:b/>
+                                    <w:bCs/>
+                                    <w:shadow/>
+                                    <w:color w:val="000000"/>
+                                    <w14:shadow w14:blurRad="38100" w14:dist="19050" w14:dir="2700000" w14:sx="100000" w14:sy="100000" w14:kx="0" w14:ky="0" w14:algn="tl">
+                                      <w14:schemeClr w14:val="dk1">
+                                        <w14:alpha w14:val="60000"/>
+                                      </w14:schemeClr>
+                                    </w14:shadow>
+                                    <w14:ligatures w14:val="none"/>
+                                  </w:rPr>
+                                </w:pPr>
+                                <w:r>
+                                  <w:rPr>
+                                    <w:rFonts w:ascii="Calibri" w:eastAsia="Calibri" w:hAnsi="Calibri"/>
+                                    <w:b/>
+                                    <w:bCs/>
+                                    <w:shadow/>
+                                    <w:color w:val="000000"/>
+                                    <w14:shadow w14:blurRad="38100" w14:dist="19050" w14:dir="2700000" w14:sx="100000" w14:sy="100000" w14:kx="0" w14:ky="0" w14:algn="tl">
+                                      <w14:schemeClr w14:val="dk1">
+                                        <w14:alpha w14:val="60000"/>
+                                      </w14:schemeClr>
+                                    </w14:shadow>
+                                  </w:rPr>
+                                  <w:t> </w:t>
+                                </w:r>
+                              </w:p>
+                            </w:txbxContent>
+                          </wps:txbx>
+                          <wps:bodyPr rot="0" spcFirstLastPara="0" vert="horz" wrap="square" lIns="0" tIns="36000" rIns="0" bIns="36000" numCol="1" spcCol="0" rtlCol="0" fromWordArt="0" anchor="ctr" anchorCtr="0" forceAA="0" compatLnSpc="1">
+                            <a:prstTxWarp prst="textNoShape">
+                              <a:avLst/>
+                            </a:prstTxWarp>
+                            <a:noAutofit/>
+                          </wps:bodyPr>
+                        </wps:wsp>
+                        <wps:wsp>
+                          <wps:cNvPr id="312178257" name="Zone de texte 1"/>
+                          <wps:cNvSpPr txBox="1"/>
+                          <wps:spPr>
+                            <a:xfrm>
+                              <a:off x="776195" y="3133216"/>
+                              <a:ext cx="107912" cy="107795"/>
+                            </a:xfrm>
+                            <a:prstGeom prst="rect">
+                              <a:avLst/>
+                            </a:prstGeom>
+                            <a:solidFill>
+                              <a:schemeClr val="lt1"/>
+                            </a:solidFill>
+                            <a:ln w="6350">
+                              <a:solidFill>
+                                <a:prstClr val="black"/>
+                              </a:solidFill>
+                            </a:ln>
+                          </wps:spPr>
+                          <wps:txbx>
+                            <w:txbxContent>
+                              <w:p>
+                                <w:pPr>
+                                  <w:spacing w:line="252" w:lineRule="auto"/>
+                                  <w:jc w:val="center"/>
+                                  <w:rPr>
+                                    <w:rFonts w:ascii="Calibri" w:eastAsia="Calibri" w:hAnsi="Calibri"/>
+                                    <w:b/>
+                                    <w:bCs/>
+                                    <w:shadow/>
+                                    <w:color w:val="000000"/>
+                                    <w14:shadow w14:blurRad="38100" w14:dist="19050" w14:dir="2700000" w14:sx="100000" w14:sy="100000" w14:kx="0" w14:ky="0" w14:algn="tl">
+                                      <w14:schemeClr w14:val="dk1">
+                                        <w14:alpha w14:val="60000"/>
+                                      </w14:schemeClr>
+                                    </w14:shadow>
+                                    <w14:ligatures w14:val="none"/>
+                                  </w:rPr>
+                                </w:pPr>
+                                <w:r>
+                                  <w:rPr>
+                                    <w:rFonts w:ascii="Calibri" w:eastAsia="Calibri" w:hAnsi="Calibri"/>
+                                    <w:b/>
+                                    <w:bCs/>
+                                    <w:shadow/>
+                                    <w:color w:val="000000"/>
+                                    <w14:shadow w14:blurRad="38100" w14:dist="19050" w14:dir="2700000" w14:sx="100000" w14:sy="100000" w14:kx="0" w14:ky="0" w14:algn="tl">
+                                      <w14:schemeClr w14:val="dk1">
+                                        <w14:alpha w14:val="60000"/>
+                                      </w14:schemeClr>
+                                    </w14:shadow>
+                                  </w:rPr>
+                                  <w:t> </w:t>
+                                </w:r>
+                              </w:p>
+                            </w:txbxContent>
+                          </wps:txbx>
+                          <wps:bodyPr rot="0" spcFirstLastPara="0" vert="horz" wrap="square" lIns="0" tIns="36000" rIns="0" bIns="36000" numCol="1" spcCol="0" rtlCol="0" fromWordArt="0" anchor="ctr" anchorCtr="0" forceAA="0" compatLnSpc="1">
+                            <a:prstTxWarp prst="textNoShape">
+                              <a:avLst/>
+                            </a:prstTxWarp>
+                            <a:noAutofit/>
+                          </wps:bodyPr>
+                        </wps:wsp>
+                        <wps:wsp>
+                          <wps:cNvPr id="225389391" name="Zone de texte 1"/>
+                          <wps:cNvSpPr txBox="1"/>
+                          <wps:spPr>
+                            <a:xfrm>
+                              <a:off x="884107" y="3133266"/>
+                              <a:ext cx="107912" cy="107795"/>
+                            </a:xfrm>
+                            <a:prstGeom prst="rect">
+                              <a:avLst/>
+                            </a:prstGeom>
+                            <a:solidFill>
+                              <a:schemeClr val="lt1"/>
+                            </a:solidFill>
+                            <a:ln w="6350">
+                              <a:solidFill>
+                                <a:prstClr val="black"/>
+                              </a:solidFill>
+                            </a:ln>
+                          </wps:spPr>
+                          <wps:txbx>
+                            <w:txbxContent>
+                              <w:p>
+                                <w:pPr>
+                                  <w:spacing w:line="252" w:lineRule="auto"/>
+                                  <w:jc w:val="center"/>
+                                  <w:rPr>
+                                    <w:rFonts w:ascii="Calibri" w:eastAsia="Calibri" w:hAnsi="Calibri"/>
+                                    <w:b/>
+                                    <w:bCs/>
+                                    <w:shadow/>
+                                    <w:color w:val="000000"/>
+                                    <w14:shadow w14:blurRad="38100" w14:dist="19050" w14:dir="2700000" w14:sx="100000" w14:sy="100000" w14:kx="0" w14:ky="0" w14:algn="tl">
+                                      <w14:schemeClr w14:val="dk1">
+                                        <w14:alpha w14:val="60000"/>
+                                      </w14:schemeClr>
+                                    </w14:shadow>
+                                    <w14:ligatures w14:val="none"/>
+                                  </w:rPr>
+                                </w:pPr>
+                                <w:r>
+                                  <w:rPr>
+                                    <w:rFonts w:ascii="Calibri" w:eastAsia="Calibri" w:hAnsi="Calibri"/>
+                                    <w:b/>
+                                    <w:bCs/>
+                                    <w:shadow/>
+                                    <w:color w:val="000000"/>
+                                    <w14:shadow w14:blurRad="38100" w14:dist="19050" w14:dir="2700000" w14:sx="100000" w14:sy="100000" w14:kx="0" w14:ky="0" w14:algn="tl">
+                                      <w14:schemeClr w14:val="dk1">
+                                        <w14:alpha w14:val="60000"/>
+                                      </w14:schemeClr>
+                                    </w14:shadow>
+                                  </w:rPr>
+                                  <w:t> </w:t>
+                                </w:r>
+                              </w:p>
+                            </w:txbxContent>
+                          </wps:txbx>
+                          <wps:bodyPr rot="0" spcFirstLastPara="0" vert="horz" wrap="square" lIns="0" tIns="36000" rIns="0" bIns="36000" numCol="1" spcCol="0" rtlCol="0" fromWordArt="0" anchor="ctr" anchorCtr="0" forceAA="0" compatLnSpc="1">
+                            <a:prstTxWarp prst="textNoShape">
+                              <a:avLst/>
+                            </a:prstTxWarp>
+                            <a:noAutofit/>
+                          </wps:bodyPr>
+                        </wps:wsp>
+                        <wps:wsp>
+                          <wps:cNvPr id="806749359" name="Zone de texte 1"/>
+                          <wps:cNvSpPr txBox="1"/>
+                          <wps:spPr>
+                            <a:xfrm>
+                              <a:off x="991384" y="3133266"/>
+                              <a:ext cx="107912" cy="107795"/>
+                            </a:xfrm>
+                            <a:prstGeom prst="rect">
+                              <a:avLst/>
+                            </a:prstGeom>
+                            <a:solidFill>
+                              <a:schemeClr val="lt1"/>
+                            </a:solidFill>
+                            <a:ln w="6350">
+                              <a:solidFill>
+                                <a:prstClr val="black"/>
+                              </a:solidFill>
+                            </a:ln>
+                          </wps:spPr>
+                          <wps:txbx>
+                            <w:txbxContent>
+                              <w:p>
+                                <w:pPr>
+                                  <w:spacing w:line="252" w:lineRule="auto"/>
+                                  <w:jc w:val="center"/>
+                                  <w:rPr>
+                                    <w:rFonts w:ascii="Calibri" w:eastAsia="Calibri" w:hAnsi="Calibri"/>
+                                    <w:b/>
+                                    <w:bCs/>
+                                    <w:shadow/>
+                                    <w:color w:val="000000"/>
+                                    <w14:shadow w14:blurRad="38100" w14:dist="19050" w14:dir="2700000" w14:sx="100000" w14:sy="100000" w14:kx="0" w14:ky="0" w14:algn="tl">
+                                      <w14:schemeClr w14:val="dk1">
+                                        <w14:alpha w14:val="60000"/>
+                                      </w14:schemeClr>
+                                    </w14:shadow>
+                                    <w14:ligatures w14:val="none"/>
+                                  </w:rPr>
+                                </w:pPr>
+                                <w:r>
+                                  <w:rPr>
+                                    <w:rFonts w:ascii="Calibri" w:eastAsia="Calibri" w:hAnsi="Calibri"/>
+                                    <w:b/>
+                                    <w:bCs/>
+                                    <w:shadow/>
+                                    <w:color w:val="000000"/>
+                                    <w14:shadow w14:blurRad="38100" w14:dist="19050" w14:dir="2700000" w14:sx="100000" w14:sy="100000" w14:kx="0" w14:ky="0" w14:algn="tl">
+                                      <w14:schemeClr w14:val="dk1">
+                                        <w14:alpha w14:val="60000"/>
+                                      </w14:schemeClr>
+                                    </w14:shadow>
+                                  </w:rPr>
+                                  <w:t> </w:t>
+                                </w:r>
+                              </w:p>
+                            </w:txbxContent>
+                          </wps:txbx>
+                          <wps:bodyPr rot="0" spcFirstLastPara="0" vert="horz" wrap="square" lIns="0" tIns="36000" rIns="0" bIns="36000" numCol="1" spcCol="0" rtlCol="0" fromWordArt="0" anchor="ctr" anchorCtr="0" forceAA="0" compatLnSpc="1">
+                            <a:prstTxWarp prst="textNoShape">
+                              <a:avLst/>
+                            </a:prstTxWarp>
+                            <a:noAutofit/>
+                          </wps:bodyPr>
+                        </wps:wsp>
+                        <wps:wsp>
+                          <wps:cNvPr id="1089509147" name="Zone de texte 1"/>
+                          <wps:cNvSpPr txBox="1"/>
+                          <wps:spPr>
+                            <a:xfrm>
+                              <a:off x="1098026" y="3133266"/>
+                              <a:ext cx="107912" cy="107795"/>
+                            </a:xfrm>
+                            <a:prstGeom prst="rect">
+                              <a:avLst/>
+                            </a:prstGeom>
+                            <a:solidFill>
+                              <a:schemeClr val="lt1"/>
+                            </a:solidFill>
+                            <a:ln w="6350">
+                              <a:solidFill>
+                                <a:prstClr val="black"/>
+                              </a:solidFill>
+                            </a:ln>
+                          </wps:spPr>
+                          <wps:txbx>
+                            <w:txbxContent>
+                              <w:p>
+                                <w:pPr>
+                                  <w:spacing w:line="252" w:lineRule="auto"/>
+                                  <w:jc w:val="center"/>
+                                  <w:rPr>
+                                    <w:rFonts w:ascii="Calibri" w:eastAsia="Calibri" w:hAnsi="Calibri"/>
+                                    <w:b/>
+                                    <w:bCs/>
+                                    <w:shadow/>
+                                    <w:color w:val="000000"/>
+                                    <w14:shadow w14:blurRad="38100" w14:dist="19050" w14:dir="2700000" w14:sx="100000" w14:sy="100000" w14:kx="0" w14:ky="0" w14:algn="tl">
+                                      <w14:schemeClr w14:val="dk1">
+                                        <w14:alpha w14:val="60000"/>
+                                      </w14:schemeClr>
+                                    </w14:shadow>
+                                    <w14:ligatures w14:val="none"/>
+                                  </w:rPr>
+                                </w:pPr>
+                                <w:r>
+                                  <w:rPr>
+                                    <w:rFonts w:ascii="Calibri" w:eastAsia="Calibri" w:hAnsi="Calibri"/>
+                                    <w:b/>
+                                    <w:bCs/>
+                                    <w:shadow/>
+                                    <w:color w:val="000000"/>
+                                    <w14:shadow w14:blurRad="38100" w14:dist="19050" w14:dir="2700000" w14:sx="100000" w14:sy="100000" w14:kx="0" w14:ky="0" w14:algn="tl">
+                                      <w14:schemeClr w14:val="dk1">
+                                        <w14:alpha w14:val="60000"/>
+                                      </w14:schemeClr>
+                                    </w14:shadow>
+                                  </w:rPr>
+                                  <w:t> </w:t>
+                                </w:r>
+                              </w:p>
+                            </w:txbxContent>
+                          </wps:txbx>
+                          <wps:bodyPr rot="0" spcFirstLastPara="0" vert="horz" wrap="square" lIns="0" tIns="36000" rIns="0" bIns="36000" numCol="1" spcCol="0" rtlCol="0" fromWordArt="0" anchor="ctr" anchorCtr="0" forceAA="0" compatLnSpc="1">
+                            <a:prstTxWarp prst="textNoShape">
+                              <a:avLst/>
+                            </a:prstTxWarp>
+                            <a:noAutofit/>
+                          </wps:bodyPr>
+                        </wps:wsp>
+                        <wps:wsp>
+                          <wps:cNvPr id="377899328" name="Zone de texte 1"/>
+                          <wps:cNvSpPr txBox="1"/>
+                          <wps:spPr>
+                            <a:xfrm>
+                              <a:off x="1205303" y="3133266"/>
+                              <a:ext cx="107912" cy="107795"/>
+                            </a:xfrm>
+                            <a:prstGeom prst="rect">
+                              <a:avLst/>
+                            </a:prstGeom>
+                            <a:solidFill>
+                              <a:schemeClr val="lt1"/>
+                            </a:solidFill>
+                            <a:ln w="6350">
+                              <a:solidFill>
+                                <a:prstClr val="black"/>
+                              </a:solidFill>
+                            </a:ln>
+                          </wps:spPr>
+                          <wps:txbx>
+                            <w:txbxContent>
+                              <w:p>
+                                <w:pPr>
+                                  <w:spacing w:line="252" w:lineRule="auto"/>
+                                  <w:jc w:val="center"/>
+                                  <w:rPr>
+                                    <w:rFonts w:ascii="Calibri" w:eastAsia="Calibri" w:hAnsi="Calibri"/>
+                                    <w:b/>
+                                    <w:bCs/>
+                                    <w:shadow/>
+                                    <w:color w:val="000000"/>
+                                    <w14:shadow w14:blurRad="38100" w14:dist="19050" w14:dir="2700000" w14:sx="100000" w14:sy="100000" w14:kx="0" w14:ky="0" w14:algn="tl">
+                                      <w14:schemeClr w14:val="dk1">
+                                        <w14:alpha w14:val="60000"/>
+                                      </w14:schemeClr>
+                                    </w14:shadow>
+                                    <w14:ligatures w14:val="none"/>
+                                  </w:rPr>
+                                </w:pPr>
+                                <w:r>
+                                  <w:rPr>
+                                    <w:rFonts w:ascii="Calibri" w:eastAsia="Calibri" w:hAnsi="Calibri"/>
+                                    <w:b/>
+                                    <w:bCs/>
+                                    <w:shadow/>
+                                    <w:color w:val="000000"/>
+                                    <w14:shadow w14:blurRad="38100" w14:dist="19050" w14:dir="2700000" w14:sx="100000" w14:sy="100000" w14:kx="0" w14:ky="0" w14:algn="tl">
+                                      <w14:schemeClr w14:val="dk1">
+                                        <w14:alpha w14:val="60000"/>
+                                      </w14:schemeClr>
+                                    </w14:shadow>
+                                  </w:rPr>
+                                  <w:t> </w:t>
+                                </w:r>
+                              </w:p>
+                            </w:txbxContent>
+                          </wps:txbx>
+                          <wps:bodyPr rot="0" spcFirstLastPara="0" vert="horz" wrap="square" lIns="0" tIns="36000" rIns="0" bIns="36000" numCol="1" spcCol="0" rtlCol="0" fromWordArt="0" anchor="ctr" anchorCtr="0" forceAA="0" compatLnSpc="1">
+                            <a:prstTxWarp prst="textNoShape">
+                              <a:avLst/>
+                            </a:prstTxWarp>
+                            <a:noAutofit/>
+                          </wps:bodyPr>
+                        </wps:wsp>
+                        <wps:wsp>
+                          <wps:cNvPr id="1683001648" name="Zone de texte 1"/>
+                          <wps:cNvSpPr txBox="1"/>
+                          <wps:spPr>
+                            <a:xfrm>
+                              <a:off x="808470" y="2923200"/>
+                              <a:ext cx="140568" cy="152510"/>
+                            </a:xfrm>
+                            <a:prstGeom prst="rect">
+                              <a:avLst/>
+                            </a:prstGeom>
+                            <a:noFill/>
+                            <a:ln w="6350">
+                              <a:solidFill>
+                                <a:schemeClr val="tx1"/>
+                              </a:solidFill>
+                            </a:ln>
+                          </wps:spPr>
+                          <wps:txbx>
+                            <w:txbxContent>
+                              <w:p>
+                                <w:pPr>
+                                  <w:spacing w:line="252" w:lineRule="auto"/>
+                                  <w:jc w:val="center"/>
+                                  <w:rPr>
+                                    <w:rFonts w:ascii="Calibri" w:eastAsia="Calibri" w:hAnsi="Calibri"/>
+                                    <w:b/>
+                                    <w:bCs/>
+                                    <w:shadow/>
+                                    <w:color w:val="000000"/>
+                                    <w:sz w:val="16"/>
+                                    <w:szCs w:val="16"/>
+                                    <w14:shadow w14:blurRad="38100" w14:dist="19050" w14:dir="2700000" w14:sx="100000" w14:sy="100000" w14:kx="0" w14:ky="0" w14:algn="tl">
+                                      <w14:schemeClr w14:val="dk1">
+                                        <w14:alpha w14:val="60000"/>
+                                      </w14:schemeClr>
+                                    </w14:shadow>
+                                    <w14:ligatures w14:val="none"/>
+                                  </w:rPr>
+                                </w:pPr>
+                                <w:r>
+                                  <w:rPr>
+                                    <w:rFonts w:ascii="Calibri" w:eastAsia="Calibri" w:hAnsi="Calibri"/>
+                                    <w:b/>
+                                    <w:bCs/>
+                                    <w:shadow/>
+                                    <w:color w:val="000000"/>
+                                    <w:sz w:val="16"/>
+                                    <w:szCs w:val="16"/>
+                                    <w14:shadow w14:blurRad="38100" w14:dist="19050" w14:dir="2700000" w14:sx="100000" w14:sy="100000" w14:kx="0" w14:ky="0" w14:algn="tl">
+                                      <w14:schemeClr w14:val="dk1">
+                                        <w14:alpha w14:val="60000"/>
+                                      </w14:schemeClr>
+                                    </w14:shadow>
+                                  </w:rPr>
+                                  <w:t>C</w:t>
+                                </w:r>
+                              </w:p>
+                            </w:txbxContent>
+                          </wps:txbx>
+                          <wps:bodyPr rot="0" spcFirstLastPara="0" vert="horz" wrap="square" lIns="0" tIns="0" rIns="0" bIns="0" numCol="1" spcCol="0" rtlCol="0" fromWordArt="0" anchor="ctr" anchorCtr="0" forceAA="0" compatLnSpc="1">
+                            <a:prstTxWarp prst="textNoShape">
+                              <a:avLst/>
+                            </a:prstTxWarp>
+                            <a:noAutofit/>
+                          </wps:bodyPr>
+                        </wps:wsp>
+                        <wps:wsp>
+                          <wps:cNvPr id="1666186605" name="Connecteur droit avec flèche 1666186605"/>
+                          <wps:cNvCnPr/>
+                          <wps:spPr>
+                            <a:xfrm flipH="1">
+                              <a:off x="606850" y="3309422"/>
+                              <a:ext cx="542296" cy="0"/>
+                            </a:xfrm>
+                            <a:prstGeom prst="straightConnector1">
+                              <a:avLst/>
+                            </a:prstGeom>
+                            <a:ln>
+                              <a:tailEnd type="triangle"/>
+                            </a:ln>
+                          </wps:spPr>
+                          <wps:style>
+                            <a:lnRef idx="1">
+                              <a:schemeClr val="dk1"/>
+                            </a:lnRef>
+                            <a:fillRef idx="0">
+                              <a:schemeClr val="dk1"/>
+                            </a:fillRef>
+                            <a:effectRef idx="0">
+                              <a:schemeClr val="dk1"/>
+                            </a:effectRef>
+                            <a:fontRef idx="minor">
+                              <a:schemeClr val="tx1"/>
+                            </a:fontRef>
+                          </wps:style>
+                          <wps:bodyPr/>
+                        </wps:wsp>
+                        <wps:wsp>
+                          <wps:cNvPr id="1412968253" name="Zone de texte 1"/>
+                          <wps:cNvSpPr txBox="1"/>
+                          <wps:spPr>
+                            <a:xfrm>
+                              <a:off x="426912" y="3233331"/>
+                              <a:ext cx="163772" cy="175009"/>
+                            </a:xfrm>
+                            <a:prstGeom prst="rect">
+                              <a:avLst/>
+                            </a:prstGeom>
+                            <a:noFill/>
+                            <a:ln w="6350">
+                              <a:noFill/>
+                            </a:ln>
+                          </wps:spPr>
+                          <wps:txbx>
+                            <w:txbxContent>
+                              <w:p>
+                                <w:pPr>
+                                  <w:spacing w:line="252" w:lineRule="auto"/>
+                                  <w:jc w:val="center"/>
+                                  <w:rPr>
+                                    <w:rFonts w:ascii="Calibri" w:eastAsia="Calibri" w:hAnsi="Calibri"/>
+                                    <w:shadow/>
+                                    <w:color w:val="000000"/>
+                                    <w:sz w:val="16"/>
+                                    <w:szCs w:val="16"/>
+                                    <w14:shadow w14:blurRad="38100" w14:dist="19050" w14:dir="2700000" w14:sx="100000" w14:sy="100000" w14:kx="0" w14:ky="0" w14:algn="tl">
+                                      <w14:schemeClr w14:val="dk1">
+                                        <w14:alpha w14:val="60000"/>
+                                      </w14:schemeClr>
+                                    </w14:shadow>
+                                    <w14:ligatures w14:val="none"/>
+                                  </w:rPr>
+                                </w:pPr>
+                                <w:r>
+                                  <w:rPr>
+                                    <w:rFonts w:ascii="Calibri" w:eastAsia="Calibri" w:hAnsi="Calibri"/>
+                                    <w:shadow/>
+                                    <w:color w:val="000000"/>
+                                    <w:sz w:val="16"/>
+                                    <w:szCs w:val="16"/>
+                                    <w14:shadow w14:blurRad="38100" w14:dist="19050" w14:dir="2700000" w14:sx="100000" w14:sy="100000" w14:kx="0" w14:ky="0" w14:algn="tl">
+                                      <w14:schemeClr w14:val="dk1">
+                                        <w14:alpha w14:val="60000"/>
+                                      </w14:schemeClr>
+                                    </w14:shadow>
+                                  </w:rPr>
+                                  <w:t>b7</w:t>
+                                </w:r>
+                              </w:p>
+                            </w:txbxContent>
+                          </wps:txbx>
+                          <wps:bodyPr rot="0" spcFirstLastPara="0" vert="horz" wrap="square" lIns="0" tIns="0" rIns="0" bIns="0" numCol="1" spcCol="0" rtlCol="0" fromWordArt="0" anchor="ctr" anchorCtr="0" forceAA="0" compatLnSpc="1">
+                            <a:prstTxWarp prst="textNoShape">
+                              <a:avLst/>
+                            </a:prstTxWarp>
+                            <a:noAutofit/>
+                          </wps:bodyPr>
+                        </wps:wsp>
+                        <wps:wsp>
+                          <wps:cNvPr id="63643643" name="Zone de texte 1"/>
+                          <wps:cNvSpPr txBox="1"/>
+                          <wps:spPr>
+                            <a:xfrm>
+                              <a:off x="1185197" y="3227695"/>
+                              <a:ext cx="163772" cy="175009"/>
+                            </a:xfrm>
+                            <a:prstGeom prst="rect">
+                              <a:avLst/>
+                            </a:prstGeom>
+                            <a:noFill/>
+                            <a:ln w="6350">
+                              <a:noFill/>
+                            </a:ln>
+                          </wps:spPr>
+                          <wps:txbx>
+                            <w:txbxContent>
+                              <w:p>
+                                <w:pPr>
+                                  <w:spacing w:line="252" w:lineRule="auto"/>
+                                  <w:jc w:val="center"/>
+                                  <w:rPr>
+                                    <w:rFonts w:ascii="Calibri" w:eastAsia="Calibri" w:hAnsi="Calibri"/>
+                                    <w:shadow/>
+                                    <w:color w:val="000000"/>
+                                    <w:sz w:val="16"/>
+                                    <w:szCs w:val="16"/>
+                                    <w14:shadow w14:blurRad="38100" w14:dist="19050" w14:dir="2700000" w14:sx="100000" w14:sy="100000" w14:kx="0" w14:ky="0" w14:algn="tl">
+                                      <w14:schemeClr w14:val="dk1">
+                                        <w14:alpha w14:val="60000"/>
+                                      </w14:schemeClr>
+                                    </w14:shadow>
+                                    <w14:ligatures w14:val="none"/>
+                                  </w:rPr>
+                                </w:pPr>
+                                <w:r>
+                                  <w:rPr>
+                                    <w:rFonts w:ascii="Calibri" w:eastAsia="Calibri" w:hAnsi="Calibri"/>
+                                    <w:shadow/>
+                                    <w:color w:val="000000"/>
+                                    <w:sz w:val="16"/>
+                                    <w:szCs w:val="16"/>
+                                    <w14:shadow w14:blurRad="38100" w14:dist="19050" w14:dir="2700000" w14:sx="100000" w14:sy="100000" w14:kx="0" w14:ky="0" w14:algn="tl">
+                                      <w14:schemeClr w14:val="dk1">
+                                        <w14:alpha w14:val="60000"/>
+                                      </w14:schemeClr>
+                                    </w14:shadow>
+                                  </w:rPr>
+                                  <w:t>b0</w:t>
+                                </w:r>
+                              </w:p>
+                            </w:txbxContent>
+                          </wps:txbx>
+                          <wps:bodyPr rot="0" spcFirstLastPara="0" vert="horz" wrap="square" lIns="0" tIns="0" rIns="0" bIns="0" numCol="1" spcCol="0" rtlCol="0" fromWordArt="0" anchor="ctr" anchorCtr="0" forceAA="0" compatLnSpc="1">
+                            <a:prstTxWarp prst="textNoShape">
+                              <a:avLst/>
+                            </a:prstTxWarp>
+                            <a:noAutofit/>
+                          </wps:bodyPr>
+                        </wps:wsp>
+                        <wps:wsp>
+                          <wps:cNvPr id="1950785009" name="Connecteur : en angle 1950785009"/>
+                          <wps:cNvCnPr>
+                            <a:stCxn id="1683001648" idx="3"/>
+                            <a:endCxn id="377899328" idx="3"/>
+                          </wps:cNvCnPr>
+                          <wps:spPr>
+                            <a:xfrm>
+                              <a:off x="949038" y="2999455"/>
+                              <a:ext cx="364177" cy="187709"/>
+                            </a:xfrm>
+                            <a:prstGeom prst="bentConnector3">
+                              <a:avLst>
+                                <a:gd name="adj1" fmla="val 139946"/>
+                              </a:avLst>
+                            </a:prstGeom>
+                            <a:ln>
+                              <a:tailEnd type="triangle"/>
+                            </a:ln>
+                          </wps:spPr>
+                          <wps:style>
+                            <a:lnRef idx="1">
+                              <a:schemeClr val="dk1"/>
+                            </a:lnRef>
+                            <a:fillRef idx="0">
+                              <a:schemeClr val="dk1"/>
+                            </a:fillRef>
+                            <a:effectRef idx="0">
+                              <a:schemeClr val="dk1"/>
+                            </a:effectRef>
+                            <a:fontRef idx="minor">
+                              <a:schemeClr val="tx1"/>
+                            </a:fontRef>
+                          </wps:style>
+                          <wps:bodyPr/>
+                        </wps:wsp>
+                        <wps:wsp>
+                          <wps:cNvPr id="74693146" name="Connecteur : en angle 74693146"/>
+                          <wps:cNvCnPr>
+                            <a:endCxn id="1807484047" idx="1"/>
+                          </wps:cNvCnPr>
+                          <wps:spPr>
+                            <a:xfrm rot="10800000" flipV="1">
+                              <a:off x="454506" y="3002973"/>
+                              <a:ext cx="344197" cy="184166"/>
+                            </a:xfrm>
+                            <a:prstGeom prst="bentConnector3">
+                              <a:avLst>
+                                <a:gd name="adj1" fmla="val 123144"/>
+                              </a:avLst>
+                            </a:prstGeom>
+                          </wps:spPr>
+                          <wps:style>
+                            <a:lnRef idx="1">
+                              <a:schemeClr val="dk1"/>
+                            </a:lnRef>
+                            <a:fillRef idx="0">
+                              <a:schemeClr val="dk1"/>
+                            </a:fillRef>
+                            <a:effectRef idx="0">
+                              <a:schemeClr val="dk1"/>
+                            </a:effectRef>
+                            <a:fontRef idx="minor">
+                              <a:schemeClr val="tx1"/>
+                            </a:fontRef>
+                          </wps:style>
+                          <wps:bodyPr/>
+                        </wps:wsp>
+                      </wpg:wgp>
+                      <wpg:wgp>
+                        <wpg:cNvPr id="972796972" name="Groupe 972796972"/>
+                        <wpg:cNvGrpSpPr/>
+                        <wpg:grpSpPr>
+                          <a:xfrm>
+                            <a:off x="1866790" y="2912809"/>
+                            <a:ext cx="922023" cy="485140"/>
+                            <a:chOff x="0" y="0"/>
+                            <a:chExt cx="922057" cy="485140"/>
+                          </a:xfrm>
+                        </wpg:grpSpPr>
+                        <wps:wsp>
+                          <wps:cNvPr id="1567451672" name="Zone de texte 1"/>
+                          <wps:cNvSpPr txBox="1"/>
+                          <wps:spPr>
+                            <a:xfrm>
+                              <a:off x="27593" y="210016"/>
+                              <a:ext cx="107962" cy="107845"/>
+                            </a:xfrm>
+                            <a:prstGeom prst="rect">
+                              <a:avLst/>
+                            </a:prstGeom>
+                            <a:solidFill>
+                              <a:schemeClr val="lt1"/>
+                            </a:solidFill>
+                            <a:ln w="6350">
+                              <a:solidFill>
+                                <a:prstClr val="black"/>
+                              </a:solidFill>
+                            </a:ln>
+                          </wps:spPr>
+                          <wps:txbx>
+                            <w:txbxContent>
+                              <w:p>
+                                <w:pPr>
+                                  <w:spacing w:line="252" w:lineRule="auto"/>
+                                  <w:jc w:val="center"/>
+                                  <w:rPr>
+                                    <w:rFonts w:ascii="Calibri" w:eastAsia="Calibri" w:hAnsi="Calibri"/>
+                                    <w:b/>
+                                    <w:bCs/>
+                                    <w:shadow/>
+                                    <w:color w:val="000000"/>
+                                    <w14:shadow w14:blurRad="38100" w14:dist="19050" w14:dir="2700000" w14:sx="100000" w14:sy="100000" w14:kx="0" w14:ky="0" w14:algn="tl">
+                                      <w14:schemeClr w14:val="dk1">
+                                        <w14:alpha w14:val="60000"/>
+                                      </w14:schemeClr>
+                                    </w14:shadow>
+                                    <w14:ligatures w14:val="none"/>
+                                  </w:rPr>
+                                </w:pPr>
+                                <w:r>
+                                  <w:rPr>
+                                    <w:rFonts w:ascii="Calibri" w:eastAsia="Calibri" w:hAnsi="Calibri"/>
+                                    <w:b/>
+                                    <w:bCs/>
+                                    <w:shadow/>
+                                    <w:color w:val="000000"/>
+                                    <w14:shadow w14:blurRad="38100" w14:dist="19050" w14:dir="2700000" w14:sx="100000" w14:sy="100000" w14:kx="0" w14:ky="0" w14:algn="tl">
+                                      <w14:schemeClr w14:val="dk1">
+                                        <w14:alpha w14:val="60000"/>
+                                      </w14:schemeClr>
+                                    </w14:shadow>
+                                  </w:rPr>
+                                  <w:t> </w:t>
+                                </w:r>
+                              </w:p>
+                            </w:txbxContent>
+                          </wps:txbx>
+                          <wps:bodyPr rot="0" spcFirstLastPara="0" vert="horz" wrap="square" lIns="0" tIns="36000" rIns="0" bIns="36000" numCol="1" spcCol="0" rtlCol="0" fromWordArt="0" anchor="ctr" anchorCtr="0" forceAA="0" compatLnSpc="1">
+                            <a:prstTxWarp prst="textNoShape">
+                              <a:avLst/>
+                            </a:prstTxWarp>
+                            <a:noAutofit/>
+                          </wps:bodyPr>
+                        </wps:wsp>
+                        <wps:wsp>
+                          <wps:cNvPr id="63943320" name="Zone de texte 1"/>
+                          <wps:cNvSpPr txBox="1"/>
+                          <wps:spPr>
+                            <a:xfrm>
+                              <a:off x="134799" y="210016"/>
+                              <a:ext cx="107912" cy="107795"/>
+                            </a:xfrm>
+                            <a:prstGeom prst="rect">
+                              <a:avLst/>
+                            </a:prstGeom>
+                            <a:solidFill>
+                              <a:schemeClr val="lt1"/>
+                            </a:solidFill>
+                            <a:ln w="6350">
+                              <a:solidFill>
+                                <a:prstClr val="black"/>
+                              </a:solidFill>
+                            </a:ln>
+                          </wps:spPr>
+                          <wps:txbx>
+                            <w:txbxContent>
+                              <w:p>
+                                <w:pPr>
+                                  <w:spacing w:line="252" w:lineRule="auto"/>
+                                  <w:jc w:val="center"/>
+                                  <w:rPr>
+                                    <w:rFonts w:ascii="Calibri" w:eastAsia="Calibri" w:hAnsi="Calibri"/>
+                                    <w:b/>
+                                    <w:bCs/>
+                                    <w:shadow/>
+                                    <w:color w:val="000000"/>
+                                    <w14:shadow w14:blurRad="38100" w14:dist="19050" w14:dir="2700000" w14:sx="100000" w14:sy="100000" w14:kx="0" w14:ky="0" w14:algn="tl">
+                                      <w14:schemeClr w14:val="dk1">
+                                        <w14:alpha w14:val="60000"/>
+                                      </w14:schemeClr>
+                                    </w14:shadow>
+                                    <w14:ligatures w14:val="none"/>
+                                  </w:rPr>
+                                </w:pPr>
+                                <w:r>
+                                  <w:rPr>
+                                    <w:rFonts w:ascii="Calibri" w:eastAsia="Calibri" w:hAnsi="Calibri"/>
+                                    <w:b/>
+                                    <w:bCs/>
+                                    <w:shadow/>
+                                    <w:color w:val="000000"/>
+                                    <w14:shadow w14:blurRad="38100" w14:dist="19050" w14:dir="2700000" w14:sx="100000" w14:sy="100000" w14:kx="0" w14:ky="0" w14:algn="tl">
+                                      <w14:schemeClr w14:val="dk1">
+                                        <w14:alpha w14:val="60000"/>
+                                      </w14:schemeClr>
+                                    </w14:shadow>
+                                  </w:rPr>
+                                  <w:t> </w:t>
+                                </w:r>
+                              </w:p>
+                            </w:txbxContent>
+                          </wps:txbx>
+                          <wps:bodyPr rot="0" spcFirstLastPara="0" vert="horz" wrap="square" lIns="0" tIns="36000" rIns="0" bIns="36000" numCol="1" spcCol="0" rtlCol="0" fromWordArt="0" anchor="ctr" anchorCtr="0" forceAA="0" compatLnSpc="1">
+                            <a:prstTxWarp prst="textNoShape">
+                              <a:avLst/>
+                            </a:prstTxWarp>
+                            <a:noAutofit/>
+                          </wps:bodyPr>
+                        </wps:wsp>
+                        <wps:wsp>
+                          <wps:cNvPr id="2127317680" name="Zone de texte 1"/>
+                          <wps:cNvSpPr txBox="1"/>
+                          <wps:spPr>
+                            <a:xfrm>
+                              <a:off x="242006" y="210016"/>
+                              <a:ext cx="107912" cy="107795"/>
+                            </a:xfrm>
+                            <a:prstGeom prst="rect">
+                              <a:avLst/>
+                            </a:prstGeom>
+                            <a:solidFill>
+                              <a:schemeClr val="lt1"/>
+                            </a:solidFill>
+                            <a:ln w="6350">
+                              <a:solidFill>
+                                <a:prstClr val="black"/>
+                              </a:solidFill>
+                            </a:ln>
+                          </wps:spPr>
+                          <wps:txbx>
+                            <w:txbxContent>
+                              <w:p>
+                                <w:pPr>
+                                  <w:spacing w:line="252" w:lineRule="auto"/>
+                                  <w:jc w:val="center"/>
+                                  <w:rPr>
+                                    <w:rFonts w:ascii="Calibri" w:eastAsia="Calibri" w:hAnsi="Calibri"/>
+                                    <w:b/>
+                                    <w:bCs/>
+                                    <w:shadow/>
+                                    <w:color w:val="000000"/>
+                                    <w14:shadow w14:blurRad="38100" w14:dist="19050" w14:dir="2700000" w14:sx="100000" w14:sy="100000" w14:kx="0" w14:ky="0" w14:algn="tl">
+                                      <w14:schemeClr w14:val="dk1">
+                                        <w14:alpha w14:val="60000"/>
+                                      </w14:schemeClr>
+                                    </w14:shadow>
+                                    <w14:ligatures w14:val="none"/>
+                                  </w:rPr>
+                                </w:pPr>
+                                <w:r>
+                                  <w:rPr>
+                                    <w:rFonts w:ascii="Calibri" w:eastAsia="Calibri" w:hAnsi="Calibri"/>
+                                    <w:b/>
+                                    <w:bCs/>
+                                    <w:shadow/>
+                                    <w:color w:val="000000"/>
+                                    <w14:shadow w14:blurRad="38100" w14:dist="19050" w14:dir="2700000" w14:sx="100000" w14:sy="100000" w14:kx="0" w14:ky="0" w14:algn="tl">
+                                      <w14:schemeClr w14:val="dk1">
+                                        <w14:alpha w14:val="60000"/>
+                                      </w14:schemeClr>
+                                    </w14:shadow>
+                                  </w:rPr>
+                                  <w:t> </w:t>
+                                </w:r>
+                              </w:p>
+                            </w:txbxContent>
+                          </wps:txbx>
+                          <wps:bodyPr rot="0" spcFirstLastPara="0" vert="horz" wrap="square" lIns="0" tIns="36000" rIns="0" bIns="36000" numCol="1" spcCol="0" rtlCol="0" fromWordArt="0" anchor="ctr" anchorCtr="0" forceAA="0" compatLnSpc="1">
+                            <a:prstTxWarp prst="textNoShape">
+                              <a:avLst/>
+                            </a:prstTxWarp>
+                            <a:noAutofit/>
+                          </wps:bodyPr>
+                        </wps:wsp>
+                        <wps:wsp>
+                          <wps:cNvPr id="51759107" name="Zone de texte 1"/>
+                          <wps:cNvSpPr txBox="1"/>
+                          <wps:spPr>
+                            <a:xfrm>
+                              <a:off x="349283" y="210016"/>
+                              <a:ext cx="107912" cy="107795"/>
+                            </a:xfrm>
+                            <a:prstGeom prst="rect">
+                              <a:avLst/>
+                            </a:prstGeom>
+                            <a:solidFill>
+                              <a:schemeClr val="lt1"/>
+                            </a:solidFill>
+                            <a:ln w="6350">
+                              <a:solidFill>
+                                <a:prstClr val="black"/>
+                              </a:solidFill>
+                            </a:ln>
+                          </wps:spPr>
+                          <wps:txbx>
+                            <w:txbxContent>
+                              <w:p>
+                                <w:pPr>
+                                  <w:spacing w:line="252" w:lineRule="auto"/>
+                                  <w:jc w:val="center"/>
+                                  <w:rPr>
+                                    <w:rFonts w:ascii="Calibri" w:eastAsia="Calibri" w:hAnsi="Calibri"/>
+                                    <w:b/>
+                                    <w:bCs/>
+                                    <w:shadow/>
+                                    <w:color w:val="000000"/>
+                                    <w14:shadow w14:blurRad="38100" w14:dist="19050" w14:dir="2700000" w14:sx="100000" w14:sy="100000" w14:kx="0" w14:ky="0" w14:algn="tl">
+                                      <w14:schemeClr w14:val="dk1">
+                                        <w14:alpha w14:val="60000"/>
+                                      </w14:schemeClr>
+                                    </w14:shadow>
+                                    <w14:ligatures w14:val="none"/>
+                                  </w:rPr>
+                                </w:pPr>
+                                <w:r>
+                                  <w:rPr>
+                                    <w:rFonts w:ascii="Calibri" w:eastAsia="Calibri" w:hAnsi="Calibri"/>
+                                    <w:b/>
+                                    <w:bCs/>
+                                    <w:shadow/>
+                                    <w:color w:val="000000"/>
+                                    <w14:shadow w14:blurRad="38100" w14:dist="19050" w14:dir="2700000" w14:sx="100000" w14:sy="100000" w14:kx="0" w14:ky="0" w14:algn="tl">
+                                      <w14:schemeClr w14:val="dk1">
+                                        <w14:alpha w14:val="60000"/>
+                                      </w14:schemeClr>
+                                    </w14:shadow>
+                                  </w:rPr>
+                                  <w:t> </w:t>
+                                </w:r>
+                              </w:p>
+                            </w:txbxContent>
+                          </wps:txbx>
+                          <wps:bodyPr rot="0" spcFirstLastPara="0" vert="horz" wrap="square" lIns="0" tIns="36000" rIns="0" bIns="36000" numCol="1" spcCol="0" rtlCol="0" fromWordArt="0" anchor="ctr" anchorCtr="0" forceAA="0" compatLnSpc="1">
+                            <a:prstTxWarp prst="textNoShape">
+                              <a:avLst/>
+                            </a:prstTxWarp>
+                            <a:noAutofit/>
+                          </wps:bodyPr>
+                        </wps:wsp>
+                        <wps:wsp>
+                          <wps:cNvPr id="14178742" name="Zone de texte 1"/>
+                          <wps:cNvSpPr txBox="1"/>
+                          <wps:spPr>
+                            <a:xfrm>
+                              <a:off x="457195" y="210066"/>
+                              <a:ext cx="107912" cy="107795"/>
+                            </a:xfrm>
+                            <a:prstGeom prst="rect">
+                              <a:avLst/>
+                            </a:prstGeom>
+                            <a:solidFill>
+                              <a:schemeClr val="lt1"/>
+                            </a:solidFill>
+                            <a:ln w="6350">
+                              <a:solidFill>
+                                <a:prstClr val="black"/>
+                              </a:solidFill>
+                            </a:ln>
+                          </wps:spPr>
+                          <wps:txbx>
+                            <w:txbxContent>
+                              <w:p>
+                                <w:pPr>
+                                  <w:spacing w:line="252" w:lineRule="auto"/>
+                                  <w:jc w:val="center"/>
+                                  <w:rPr>
+                                    <w:rFonts w:ascii="Calibri" w:eastAsia="Calibri" w:hAnsi="Calibri"/>
+                                    <w:b/>
+                                    <w:bCs/>
+                                    <w:shadow/>
+                                    <w:color w:val="000000"/>
+                                    <w14:shadow w14:blurRad="38100" w14:dist="19050" w14:dir="2700000" w14:sx="100000" w14:sy="100000" w14:kx="0" w14:ky="0" w14:algn="tl">
+                                      <w14:schemeClr w14:val="dk1">
+                                        <w14:alpha w14:val="60000"/>
+                                      </w14:schemeClr>
+                                    </w14:shadow>
+                                    <w14:ligatures w14:val="none"/>
+                                  </w:rPr>
+                                </w:pPr>
+                                <w:r>
+                                  <w:rPr>
+                                    <w:rFonts w:ascii="Calibri" w:eastAsia="Calibri" w:hAnsi="Calibri"/>
+                                    <w:b/>
+                                    <w:bCs/>
+                                    <w:shadow/>
+                                    <w:color w:val="000000"/>
+                                    <w14:shadow w14:blurRad="38100" w14:dist="19050" w14:dir="2700000" w14:sx="100000" w14:sy="100000" w14:kx="0" w14:ky="0" w14:algn="tl">
+                                      <w14:schemeClr w14:val="dk1">
+                                        <w14:alpha w14:val="60000"/>
+                                      </w14:schemeClr>
+                                    </w14:shadow>
+                                  </w:rPr>
+                                  <w:t> </w:t>
+                                </w:r>
+                              </w:p>
+                            </w:txbxContent>
+                          </wps:txbx>
+                          <wps:bodyPr rot="0" spcFirstLastPara="0" vert="horz" wrap="square" lIns="0" tIns="36000" rIns="0" bIns="36000" numCol="1" spcCol="0" rtlCol="0" fromWordArt="0" anchor="ctr" anchorCtr="0" forceAA="0" compatLnSpc="1">
+                            <a:prstTxWarp prst="textNoShape">
+                              <a:avLst/>
+                            </a:prstTxWarp>
+                            <a:noAutofit/>
+                          </wps:bodyPr>
+                        </wps:wsp>
+                        <wps:wsp>
+                          <wps:cNvPr id="792259450" name="Zone de texte 1"/>
+                          <wps:cNvSpPr txBox="1"/>
+                          <wps:spPr>
+                            <a:xfrm>
+                              <a:off x="564472" y="210066"/>
+                              <a:ext cx="107912" cy="107795"/>
+                            </a:xfrm>
+                            <a:prstGeom prst="rect">
+                              <a:avLst/>
+                            </a:prstGeom>
+                            <a:solidFill>
+                              <a:schemeClr val="lt1"/>
+                            </a:solidFill>
+                            <a:ln w="6350">
+                              <a:solidFill>
+                                <a:prstClr val="black"/>
+                              </a:solidFill>
+                            </a:ln>
+                          </wps:spPr>
+                          <wps:txbx>
+                            <w:txbxContent>
+                              <w:p>
+                                <w:pPr>
+                                  <w:spacing w:line="252" w:lineRule="auto"/>
+                                  <w:jc w:val="center"/>
+                                  <w:rPr>
+                                    <w:rFonts w:ascii="Calibri" w:eastAsia="Calibri" w:hAnsi="Calibri"/>
+                                    <w:b/>
+                                    <w:bCs/>
+                                    <w:shadow/>
+                                    <w:color w:val="000000"/>
+                                    <w14:shadow w14:blurRad="38100" w14:dist="19050" w14:dir="2700000" w14:sx="100000" w14:sy="100000" w14:kx="0" w14:ky="0" w14:algn="tl">
+                                      <w14:schemeClr w14:val="dk1">
+                                        <w14:alpha w14:val="60000"/>
+                                      </w14:schemeClr>
+                                    </w14:shadow>
+                                    <w14:ligatures w14:val="none"/>
+                                  </w:rPr>
+                                </w:pPr>
+                                <w:r>
+                                  <w:rPr>
+                                    <w:rFonts w:ascii="Calibri" w:eastAsia="Calibri" w:hAnsi="Calibri"/>
+                                    <w:b/>
+                                    <w:bCs/>
+                                    <w:shadow/>
+                                    <w:color w:val="000000"/>
+                                    <w14:shadow w14:blurRad="38100" w14:dist="19050" w14:dir="2700000" w14:sx="100000" w14:sy="100000" w14:kx="0" w14:ky="0" w14:algn="tl">
+                                      <w14:schemeClr w14:val="dk1">
+                                        <w14:alpha w14:val="60000"/>
+                                      </w14:schemeClr>
+                                    </w14:shadow>
+                                  </w:rPr>
+                                  <w:t> </w:t>
+                                </w:r>
+                              </w:p>
+                            </w:txbxContent>
+                          </wps:txbx>
+                          <wps:bodyPr rot="0" spcFirstLastPara="0" vert="horz" wrap="square" lIns="0" tIns="36000" rIns="0" bIns="36000" numCol="1" spcCol="0" rtlCol="0" fromWordArt="0" anchor="ctr" anchorCtr="0" forceAA="0" compatLnSpc="1">
+                            <a:prstTxWarp prst="textNoShape">
+                              <a:avLst/>
+                            </a:prstTxWarp>
+                            <a:noAutofit/>
+                          </wps:bodyPr>
+                        </wps:wsp>
+                        <wps:wsp>
+                          <wps:cNvPr id="1645267306" name="Zone de texte 1"/>
+                          <wps:cNvSpPr txBox="1"/>
+                          <wps:spPr>
+                            <a:xfrm>
+                              <a:off x="671114" y="210066"/>
+                              <a:ext cx="107912" cy="107795"/>
+                            </a:xfrm>
+                            <a:prstGeom prst="rect">
+                              <a:avLst/>
+                            </a:prstGeom>
+                            <a:solidFill>
+                              <a:schemeClr val="lt1"/>
+                            </a:solidFill>
+                            <a:ln w="6350">
+                              <a:solidFill>
+                                <a:prstClr val="black"/>
+                              </a:solidFill>
+                            </a:ln>
+                          </wps:spPr>
+                          <wps:txbx>
+                            <w:txbxContent>
+                              <w:p>
+                                <w:pPr>
+                                  <w:spacing w:line="252" w:lineRule="auto"/>
+                                  <w:jc w:val="center"/>
+                                  <w:rPr>
+                                    <w:rFonts w:ascii="Calibri" w:eastAsia="Calibri" w:hAnsi="Calibri"/>
+                                    <w:b/>
+                                    <w:bCs/>
+                                    <w:shadow/>
+                                    <w:color w:val="000000"/>
+                                    <w14:shadow w14:blurRad="38100" w14:dist="19050" w14:dir="2700000" w14:sx="100000" w14:sy="100000" w14:kx="0" w14:ky="0" w14:algn="tl">
+                                      <w14:schemeClr w14:val="dk1">
+                                        <w14:alpha w14:val="60000"/>
+                                      </w14:schemeClr>
+                                    </w14:shadow>
+                                    <w14:ligatures w14:val="none"/>
+                                  </w:rPr>
+                                </w:pPr>
+                                <w:r>
+                                  <w:rPr>
+                                    <w:rFonts w:ascii="Calibri" w:eastAsia="Calibri" w:hAnsi="Calibri"/>
+                                    <w:b/>
+                                    <w:bCs/>
+                                    <w:shadow/>
+                                    <w:color w:val="000000"/>
+                                    <w14:shadow w14:blurRad="38100" w14:dist="19050" w14:dir="2700000" w14:sx="100000" w14:sy="100000" w14:kx="0" w14:ky="0" w14:algn="tl">
+                                      <w14:schemeClr w14:val="dk1">
+                                        <w14:alpha w14:val="60000"/>
+                                      </w14:schemeClr>
+                                    </w14:shadow>
+                                  </w:rPr>
+                                  <w:t> </w:t>
+                                </w:r>
+                              </w:p>
+                            </w:txbxContent>
+                          </wps:txbx>
+                          <wps:bodyPr rot="0" spcFirstLastPara="0" vert="horz" wrap="square" lIns="0" tIns="36000" rIns="0" bIns="36000" numCol="1" spcCol="0" rtlCol="0" fromWordArt="0" anchor="ctr" anchorCtr="0" forceAA="0" compatLnSpc="1">
+                            <a:prstTxWarp prst="textNoShape">
+                              <a:avLst/>
+                            </a:prstTxWarp>
+                            <a:noAutofit/>
+                          </wps:bodyPr>
+                        </wps:wsp>
+                        <wps:wsp>
+                          <wps:cNvPr id="467086912" name="Zone de texte 1"/>
+                          <wps:cNvSpPr txBox="1"/>
+                          <wps:spPr>
+                            <a:xfrm>
+                              <a:off x="778391" y="210066"/>
+                              <a:ext cx="107912" cy="107795"/>
+                            </a:xfrm>
+                            <a:prstGeom prst="rect">
+                              <a:avLst/>
+                            </a:prstGeom>
+                            <a:solidFill>
+                              <a:schemeClr val="lt1"/>
+                            </a:solidFill>
+                            <a:ln w="6350">
+                              <a:solidFill>
+                                <a:prstClr val="black"/>
+                              </a:solidFill>
+                            </a:ln>
+                          </wps:spPr>
+                          <wps:txbx>
+                            <w:txbxContent>
+                              <w:p>
+                                <w:pPr>
+                                  <w:spacing w:line="252" w:lineRule="auto"/>
+                                  <w:jc w:val="center"/>
+                                  <w:rPr>
+                                    <w:rFonts w:ascii="Calibri" w:eastAsia="Calibri" w:hAnsi="Calibri"/>
+                                    <w:b/>
+                                    <w:bCs/>
+                                    <w:shadow/>
+                                    <w:color w:val="000000"/>
+                                    <w14:shadow w14:blurRad="38100" w14:dist="19050" w14:dir="2700000" w14:sx="100000" w14:sy="100000" w14:kx="0" w14:ky="0" w14:algn="tl">
+                                      <w14:schemeClr w14:val="dk1">
+                                        <w14:alpha w14:val="60000"/>
+                                      </w14:schemeClr>
+                                    </w14:shadow>
+                                    <w14:ligatures w14:val="none"/>
+                                  </w:rPr>
+                                </w:pPr>
+                                <w:r>
+                                  <w:rPr>
+                                    <w:rFonts w:ascii="Calibri" w:eastAsia="Calibri" w:hAnsi="Calibri"/>
+                                    <w:b/>
+                                    <w:bCs/>
+                                    <w:shadow/>
+                                    <w:color w:val="000000"/>
+                                    <w14:shadow w14:blurRad="38100" w14:dist="19050" w14:dir="2700000" w14:sx="100000" w14:sy="100000" w14:kx="0" w14:ky="0" w14:algn="tl">
+                                      <w14:schemeClr w14:val="dk1">
+                                        <w14:alpha w14:val="60000"/>
+                                      </w14:schemeClr>
+                                    </w14:shadow>
+                                  </w:rPr>
+                                  <w:t> </w:t>
+                                </w:r>
+                              </w:p>
+                            </w:txbxContent>
+                          </wps:txbx>
+                          <wps:bodyPr rot="0" spcFirstLastPara="0" vert="horz" wrap="square" lIns="0" tIns="36000" rIns="0" bIns="36000" numCol="1" spcCol="0" rtlCol="0" fromWordArt="0" anchor="ctr" anchorCtr="0" forceAA="0" compatLnSpc="1">
+                            <a:prstTxWarp prst="textNoShape">
+                              <a:avLst/>
+                            </a:prstTxWarp>
+                            <a:noAutofit/>
+                          </wps:bodyPr>
+                        </wps:wsp>
+                        <wps:wsp>
+                          <wps:cNvPr id="1425425052" name="Zone de texte 1"/>
+                          <wps:cNvSpPr txBox="1"/>
+                          <wps:spPr>
+                            <a:xfrm>
+                              <a:off x="381558" y="0"/>
+                              <a:ext cx="140568" cy="152510"/>
+                            </a:xfrm>
+                            <a:prstGeom prst="rect">
+                              <a:avLst/>
+                            </a:prstGeom>
+                            <a:noFill/>
+                            <a:ln w="6350">
+                              <a:solidFill>
+                                <a:schemeClr val="tx1"/>
+                              </a:solidFill>
+                            </a:ln>
+                          </wps:spPr>
+                          <wps:txbx>
+                            <w:txbxContent>
+                              <w:p>
+                                <w:pPr>
+                                  <w:spacing w:line="252" w:lineRule="auto"/>
+                                  <w:jc w:val="center"/>
+                                  <w:rPr>
+                                    <w:rFonts w:ascii="Calibri" w:eastAsia="Calibri" w:hAnsi="Calibri"/>
+                                    <w:b/>
+                                    <w:bCs/>
+                                    <w:shadow/>
+                                    <w:color w:val="000000"/>
+                                    <w:sz w:val="16"/>
+                                    <w:szCs w:val="16"/>
+                                    <w14:shadow w14:blurRad="38100" w14:dist="19050" w14:dir="2700000" w14:sx="100000" w14:sy="100000" w14:kx="0" w14:ky="0" w14:algn="tl">
+                                      <w14:schemeClr w14:val="dk1">
+                                        <w14:alpha w14:val="60000"/>
+                                      </w14:schemeClr>
+                                    </w14:shadow>
+                                    <w14:ligatures w14:val="none"/>
+                                  </w:rPr>
+                                </w:pPr>
+                                <w:r>
+                                  <w:rPr>
+                                    <w:rFonts w:ascii="Calibri" w:eastAsia="Calibri" w:hAnsi="Calibri"/>
+                                    <w:b/>
+                                    <w:bCs/>
+                                    <w:shadow/>
+                                    <w:color w:val="000000"/>
+                                    <w:sz w:val="16"/>
+                                    <w:szCs w:val="16"/>
+                                    <w14:shadow w14:blurRad="38100" w14:dist="19050" w14:dir="2700000" w14:sx="100000" w14:sy="100000" w14:kx="0" w14:ky="0" w14:algn="tl">
+                                      <w14:schemeClr w14:val="dk1">
+                                        <w14:alpha w14:val="60000"/>
+                                      </w14:schemeClr>
+                                    </w14:shadow>
+                                  </w:rPr>
+                                  <w:t>C</w:t>
+                                </w:r>
+                              </w:p>
+                            </w:txbxContent>
+                          </wps:txbx>
+                          <wps:bodyPr rot="0" spcFirstLastPara="0" vert="horz" wrap="square" lIns="0" tIns="0" rIns="0" bIns="0" numCol="1" spcCol="0" rtlCol="0" fromWordArt="0" anchor="ctr" anchorCtr="0" forceAA="0" compatLnSpc="1">
+                            <a:prstTxWarp prst="textNoShape">
+                              <a:avLst/>
+                            </a:prstTxWarp>
+                            <a:noAutofit/>
+                          </wps:bodyPr>
+                        </wps:wsp>
+                        <wps:wsp>
+                          <wps:cNvPr id="571364796" name="Connecteur droit avec flèche 571364796"/>
+                          <wps:cNvCnPr/>
+                          <wps:spPr>
+                            <a:xfrm flipH="1">
+                              <a:off x="179938" y="386222"/>
+                              <a:ext cx="542296" cy="0"/>
+                            </a:xfrm>
+                            <a:prstGeom prst="straightConnector1">
+                              <a:avLst/>
+                            </a:prstGeom>
+                            <a:ln>
+                              <a:headEnd type="triangle"/>
+                              <a:tailEnd type="none"/>
+                            </a:ln>
+                          </wps:spPr>
+                          <wps:style>
+                            <a:lnRef idx="1">
+                              <a:schemeClr val="dk1"/>
+                            </a:lnRef>
+                            <a:fillRef idx="0">
+                              <a:schemeClr val="dk1"/>
+                            </a:fillRef>
+                            <a:effectRef idx="0">
+                              <a:schemeClr val="dk1"/>
+                            </a:effectRef>
+                            <a:fontRef idx="minor">
+                              <a:schemeClr val="tx1"/>
+                            </a:fontRef>
+                          </wps:style>
+                          <wps:bodyPr/>
+                        </wps:wsp>
+                        <wps:wsp>
+                          <wps:cNvPr id="565308514" name="Zone de texte 1"/>
+                          <wps:cNvSpPr txBox="1"/>
+                          <wps:spPr>
+                            <a:xfrm>
+                              <a:off x="0" y="310131"/>
+                              <a:ext cx="163772" cy="175009"/>
+                            </a:xfrm>
+                            <a:prstGeom prst="rect">
+                              <a:avLst/>
+                            </a:prstGeom>
+                            <a:noFill/>
+                            <a:ln w="6350">
+                              <a:noFill/>
+                            </a:ln>
+                          </wps:spPr>
+                          <wps:txbx>
+                            <w:txbxContent>
+                              <w:p>
+                                <w:pPr>
+                                  <w:spacing w:line="252" w:lineRule="auto"/>
+                                  <w:jc w:val="center"/>
+                                  <w:rPr>
+                                    <w:rFonts w:ascii="Calibri" w:eastAsia="Calibri" w:hAnsi="Calibri"/>
+                                    <w:shadow/>
+                                    <w:color w:val="000000"/>
+                                    <w:sz w:val="16"/>
+                                    <w:szCs w:val="16"/>
+                                    <w14:shadow w14:blurRad="38100" w14:dist="19050" w14:dir="2700000" w14:sx="100000" w14:sy="100000" w14:kx="0" w14:ky="0" w14:algn="tl">
+                                      <w14:schemeClr w14:val="dk1">
+                                        <w14:alpha w14:val="60000"/>
+                                      </w14:schemeClr>
+                                    </w14:shadow>
+                                    <w14:ligatures w14:val="none"/>
+                                  </w:rPr>
+                                </w:pPr>
+                                <w:r>
+                                  <w:rPr>
+                                    <w:rFonts w:ascii="Calibri" w:eastAsia="Calibri" w:hAnsi="Calibri"/>
+                                    <w:shadow/>
+                                    <w:color w:val="000000"/>
+                                    <w:sz w:val="16"/>
+                                    <w:szCs w:val="16"/>
+                                    <w14:shadow w14:blurRad="38100" w14:dist="19050" w14:dir="2700000" w14:sx="100000" w14:sy="100000" w14:kx="0" w14:ky="0" w14:algn="tl">
+                                      <w14:schemeClr w14:val="dk1">
+                                        <w14:alpha w14:val="60000"/>
+                                      </w14:schemeClr>
+                                    </w14:shadow>
+                                  </w:rPr>
+                                  <w:t>b7</w:t>
+                                </w:r>
+                              </w:p>
+                            </w:txbxContent>
+                          </wps:txbx>
+                          <wps:bodyPr rot="0" spcFirstLastPara="0" vert="horz" wrap="square" lIns="0" tIns="0" rIns="0" bIns="0" numCol="1" spcCol="0" rtlCol="0" fromWordArt="0" anchor="ctr" anchorCtr="0" forceAA="0" compatLnSpc="1">
+                            <a:prstTxWarp prst="textNoShape">
+                              <a:avLst/>
+                            </a:prstTxWarp>
+                            <a:noAutofit/>
+                          </wps:bodyPr>
+                        </wps:wsp>
+                        <wps:wsp>
+                          <wps:cNvPr id="553357045" name="Zone de texte 1"/>
+                          <wps:cNvSpPr txBox="1"/>
+                          <wps:spPr>
+                            <a:xfrm>
+                              <a:off x="758285" y="304495"/>
+                              <a:ext cx="163772" cy="175009"/>
+                            </a:xfrm>
+                            <a:prstGeom prst="rect">
+                              <a:avLst/>
+                            </a:prstGeom>
+                            <a:noFill/>
+                            <a:ln w="6350">
+                              <a:noFill/>
+                            </a:ln>
+                          </wps:spPr>
+                          <wps:txbx>
+                            <w:txbxContent>
+                              <w:p>
+                                <w:pPr>
+                                  <w:spacing w:line="252" w:lineRule="auto"/>
+                                  <w:jc w:val="center"/>
+                                  <w:rPr>
+                                    <w:rFonts w:ascii="Calibri" w:eastAsia="Calibri" w:hAnsi="Calibri"/>
+                                    <w:shadow/>
+                                    <w:color w:val="000000"/>
+                                    <w:sz w:val="16"/>
+                                    <w:szCs w:val="16"/>
+                                    <w14:shadow w14:blurRad="38100" w14:dist="19050" w14:dir="2700000" w14:sx="100000" w14:sy="100000" w14:kx="0" w14:ky="0" w14:algn="tl">
+                                      <w14:schemeClr w14:val="dk1">
+                                        <w14:alpha w14:val="60000"/>
+                                      </w14:schemeClr>
+                                    </w14:shadow>
+                                    <w14:ligatures w14:val="none"/>
+                                  </w:rPr>
+                                </w:pPr>
+                                <w:r>
+                                  <w:rPr>
+                                    <w:rFonts w:ascii="Calibri" w:eastAsia="Calibri" w:hAnsi="Calibri"/>
+                                    <w:shadow/>
+                                    <w:color w:val="000000"/>
+                                    <w:sz w:val="16"/>
+                                    <w:szCs w:val="16"/>
+                                    <w14:shadow w14:blurRad="38100" w14:dist="19050" w14:dir="2700000" w14:sx="100000" w14:sy="100000" w14:kx="0" w14:ky="0" w14:algn="tl">
+                                      <w14:schemeClr w14:val="dk1">
+                                        <w14:alpha w14:val="60000"/>
+                                      </w14:schemeClr>
+                                    </w14:shadow>
+                                  </w:rPr>
+                                  <w:t>b0</w:t>
+                                </w:r>
+                              </w:p>
+                            </w:txbxContent>
+                          </wps:txbx>
+                          <wps:bodyPr rot="0" spcFirstLastPara="0" vert="horz" wrap="square" lIns="0" tIns="0" rIns="0" bIns="0" numCol="1" spcCol="0" rtlCol="0" fromWordArt="0" anchor="ctr" anchorCtr="0" forceAA="0" compatLnSpc="1">
+                            <a:prstTxWarp prst="textNoShape">
+                              <a:avLst/>
+                            </a:prstTxWarp>
+                            <a:noAutofit/>
+                          </wps:bodyPr>
+                        </wps:wsp>
+                        <wps:wsp>
+                          <wps:cNvPr id="575741132" name="Connecteur : en angle 575741132"/>
+                          <wps:cNvCnPr/>
+                          <wps:spPr>
+                            <a:xfrm>
+                              <a:off x="522126" y="76255"/>
+                              <a:ext cx="364177" cy="187709"/>
+                            </a:xfrm>
+                            <a:prstGeom prst="bentConnector3">
+                              <a:avLst>
+                                <a:gd name="adj1" fmla="val 139946"/>
+                              </a:avLst>
+                            </a:prstGeom>
+                            <a:ln>
+                              <a:tailEnd type="none"/>
+                            </a:ln>
+                          </wps:spPr>
+                          <wps:style>
+                            <a:lnRef idx="1">
+                              <a:schemeClr val="dk1"/>
+                            </a:lnRef>
+                            <a:fillRef idx="0">
+                              <a:schemeClr val="dk1"/>
+                            </a:fillRef>
+                            <a:effectRef idx="0">
+                              <a:schemeClr val="dk1"/>
+                            </a:effectRef>
+                            <a:fontRef idx="minor">
+                              <a:schemeClr val="tx1"/>
+                            </a:fontRef>
+                          </wps:style>
+                          <wps:bodyPr/>
+                        </wps:wsp>
+                        <wps:wsp>
+                          <wps:cNvPr id="14753419" name="Connecteur : en angle 14753419"/>
+                          <wps:cNvCnPr/>
+                          <wps:spPr>
+                            <a:xfrm rot="10800000" flipV="1">
+                              <a:off x="27594" y="79773"/>
+                              <a:ext cx="344197" cy="184166"/>
+                            </a:xfrm>
+                            <a:prstGeom prst="bentConnector3">
+                              <a:avLst>
+                                <a:gd name="adj1" fmla="val 144277"/>
+                              </a:avLst>
+                            </a:prstGeom>
+                            <a:ln>
+                              <a:tailEnd type="triangle"/>
+                            </a:ln>
+                          </wps:spPr>
+                          <wps:style>
+                            <a:lnRef idx="1">
+                              <a:schemeClr val="dk1"/>
+                            </a:lnRef>
+                            <a:fillRef idx="0">
+                              <a:schemeClr val="dk1"/>
+                            </a:fillRef>
+                            <a:effectRef idx="0">
+                              <a:schemeClr val="dk1"/>
+                            </a:effectRef>
+                            <a:fontRef idx="minor">
+                              <a:schemeClr val="tx1"/>
+                            </a:fontRef>
+                          </wps:style>
+                          <wps:bodyPr/>
+                        </wps:wsp>
+                      </wpg:wgp>
                     </wpc:wpc>
                   </a:graphicData>
                 </a:graphic>
@@ -7774,7 +9413,7 @@
           </mc:Choice>
           <mc:Fallback>
             <w:pict>
-              <v:group w14:anchorId="1D31CDC9" id="Zone de dessin 2" o:spid="_x0000_s1026" editas="canvas" style="width:6in;height:252pt;mso-position-horizontal-relative:char;mso-position-vertical-relative:line" coordsize="54864,32004" o:gfxdata="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">
+              <v:group w14:anchorId="1D31CDC9" id="Zone de dessin 2" o:spid="_x0000_s1026" editas="canvas" style="width:6in;height:465pt;mso-position-horizontal-relative:char;mso-position-vertical-relative:line" coordsize="54864,59055" o:gfxdata="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">
                 <v:shapetype id="_x0000_t75" coordsize="21600,21600" o:spt="75" o:preferrelative="t" path="m@4@5l@4@11@9@11@9@5xe" filled="f" stroked="f">
                   <v:stroke joinstyle="miter"/>
                   <v:formulas>
@@ -7794,7 +9433,7 @@
                   <v:path o:extrusionok="f" gradientshapeok="t" o:connecttype="rect"/>
                   <o:lock v:ext="edit" aspectratio="t"/>
                 </v:shapetype>
-                <v:shape id="_x0000_s1027" type="#_x0000_t75" style="position:absolute;width:54864;height:32004;visibility:visible;mso-wrap-style:square" filled="t">
+                <v:shape id="_x0000_s1027" type="#_x0000_t75" style="position:absolute;width:54864;height:59055;visibility:visible;mso-wrap-style:square" filled="t">
                   <v:fill o:detectmouseclick="t"/>
                   <v:path o:connecttype="none"/>
                 </v:shape>
@@ -12422,6 +14061,923 @@
                   </v:shape>
                   <v:shape id="Connecteur droit avec flèche 1890358760" o:spid="_x0000_s1164" type="#_x0000_t32" style="position:absolute;left:4628;top:5067;width:5422;height:0;flip:x;visibility:visible;mso-wrap-style:square" o:connectortype="straight" o:gfxdata="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" strokecolor="black [3200]" strokeweight=".5pt">
                     <v:stroke endarrow="block" joinstyle="miter"/>
+                  </v:shape>
+                </v:group>
+                <v:group id="Groupe 1270731583" o:spid="_x0000_s1165" style="position:absolute;left:4269;top:29232;width:9220;height:4851" coordorigin="4269,29232" coordsize="9220,4851" o:gfxdata="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">
+                  <v:shape id="Zone de texte 1" o:spid="_x0000_s1166" type="#_x0000_t202" style="position:absolute;left:4545;top:31332;width:1079;height:1078;visibility:visible;mso-wrap-style:square;v-text-anchor:middle" o:gfxdata="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" fillcolor="white [3201]" strokeweight=".5pt">
+                    <v:textbox inset="0,1mm,0,1mm">
+                      <w:txbxContent>
+                        <w:p>
+                          <w:pPr>
+                            <w:spacing w:line="252" w:lineRule="auto"/>
+                            <w:jc w:val="center"/>
+                            <w:rPr>
+                              <w:rFonts w:ascii="Calibri" w:eastAsia="Calibri" w:hAnsi="Calibri"/>
+                              <w:b/>
+                              <w:bCs/>
+                              <w:shadow/>
+                              <w:color w:val="000000"/>
+                              <w14:shadow w14:blurRad="38100" w14:dist="19050" w14:dir="2700000" w14:sx="100000" w14:sy="100000" w14:kx="0" w14:ky="0" w14:algn="tl">
+                                <w14:schemeClr w14:val="dk1">
+                                  <w14:alpha w14:val="60000"/>
+                                </w14:schemeClr>
+                              </w14:shadow>
+                              <w14:ligatures w14:val="none"/>
+                            </w:rPr>
+                          </w:pPr>
+                          <w:r>
+                            <w:rPr>
+                              <w:rFonts w:ascii="Calibri" w:eastAsia="Calibri" w:hAnsi="Calibri"/>
+                              <w:b/>
+                              <w:bCs/>
+                              <w:shadow/>
+                              <w:color w:val="000000"/>
+                              <w14:shadow w14:blurRad="38100" w14:dist="19050" w14:dir="2700000" w14:sx="100000" w14:sy="100000" w14:kx="0" w14:ky="0" w14:algn="tl">
+                                <w14:schemeClr w14:val="dk1">
+                                  <w14:alpha w14:val="60000"/>
+                                </w14:schemeClr>
+                              </w14:shadow>
+                            </w:rPr>
+                            <w:t> </w:t>
+                          </w:r>
+                        </w:p>
+                      </w:txbxContent>
+                    </v:textbox>
+                  </v:shape>
+                  <v:shape id="Zone de texte 1" o:spid="_x0000_s1167" type="#_x0000_t202" style="position:absolute;left:5617;top:31332;width:1079;height:1078;visibility:visible;mso-wrap-style:square;v-text-anchor:middle" o:gfxdata="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" fillcolor="white [3201]" strokeweight=".5pt">
+                    <v:textbox inset="0,1mm,0,1mm">
+                      <w:txbxContent>
+                        <w:p>
+                          <w:pPr>
+                            <w:spacing w:line="252" w:lineRule="auto"/>
+                            <w:jc w:val="center"/>
+                            <w:rPr>
+                              <w:rFonts w:ascii="Calibri" w:eastAsia="Calibri" w:hAnsi="Calibri"/>
+                              <w:b/>
+                              <w:bCs/>
+                              <w:shadow/>
+                              <w:color w:val="000000"/>
+                              <w14:shadow w14:blurRad="38100" w14:dist="19050" w14:dir="2700000" w14:sx="100000" w14:sy="100000" w14:kx="0" w14:ky="0" w14:algn="tl">
+                                <w14:schemeClr w14:val="dk1">
+                                  <w14:alpha w14:val="60000"/>
+                                </w14:schemeClr>
+                              </w14:shadow>
+                              <w14:ligatures w14:val="none"/>
+                            </w:rPr>
+                          </w:pPr>
+                          <w:r>
+                            <w:rPr>
+                              <w:rFonts w:ascii="Calibri" w:eastAsia="Calibri" w:hAnsi="Calibri"/>
+                              <w:b/>
+                              <w:bCs/>
+                              <w:shadow/>
+                              <w:color w:val="000000"/>
+                              <w14:shadow w14:blurRad="38100" w14:dist="19050" w14:dir="2700000" w14:sx="100000" w14:sy="100000" w14:kx="0" w14:ky="0" w14:algn="tl">
+                                <w14:schemeClr w14:val="dk1">
+                                  <w14:alpha w14:val="60000"/>
+                                </w14:schemeClr>
+                              </w14:shadow>
+                            </w:rPr>
+                            <w:t> </w:t>
+                          </w:r>
+                        </w:p>
+                      </w:txbxContent>
+                    </v:textbox>
+                  </v:shape>
+                  <v:shape id="Zone de texte 1" o:spid="_x0000_s1168" type="#_x0000_t202" style="position:absolute;left:6689;top:31332;width:1079;height:1078;visibility:visible;mso-wrap-style:square;v-text-anchor:middle" o:gfxdata="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" fillcolor="white [3201]" strokeweight=".5pt">
+                    <v:textbox inset="0,1mm,0,1mm">
+                      <w:txbxContent>
+                        <w:p>
+                          <w:pPr>
+                            <w:spacing w:line="252" w:lineRule="auto"/>
+                            <w:jc w:val="center"/>
+                            <w:rPr>
+                              <w:rFonts w:ascii="Calibri" w:eastAsia="Calibri" w:hAnsi="Calibri"/>
+                              <w:b/>
+                              <w:bCs/>
+                              <w:shadow/>
+                              <w:color w:val="000000"/>
+                              <w14:shadow w14:blurRad="38100" w14:dist="19050" w14:dir="2700000" w14:sx="100000" w14:sy="100000" w14:kx="0" w14:ky="0" w14:algn="tl">
+                                <w14:schemeClr w14:val="dk1">
+                                  <w14:alpha w14:val="60000"/>
+                                </w14:schemeClr>
+                              </w14:shadow>
+                              <w14:ligatures w14:val="none"/>
+                            </w:rPr>
+                          </w:pPr>
+                          <w:r>
+                            <w:rPr>
+                              <w:rFonts w:ascii="Calibri" w:eastAsia="Calibri" w:hAnsi="Calibri"/>
+                              <w:b/>
+                              <w:bCs/>
+                              <w:shadow/>
+                              <w:color w:val="000000"/>
+                              <w14:shadow w14:blurRad="38100" w14:dist="19050" w14:dir="2700000" w14:sx="100000" w14:sy="100000" w14:kx="0" w14:ky="0" w14:algn="tl">
+                                <w14:schemeClr w14:val="dk1">
+                                  <w14:alpha w14:val="60000"/>
+                                </w14:schemeClr>
+                              </w14:shadow>
+                            </w:rPr>
+                            <w:t> </w:t>
+                          </w:r>
+                        </w:p>
+                      </w:txbxContent>
+                    </v:textbox>
+                  </v:shape>
+                  <v:shape id="Zone de texte 1" o:spid="_x0000_s1169" type="#_x0000_t202" style="position:absolute;left:7761;top:31332;width:1080;height:1078;visibility:visible;mso-wrap-style:square;v-text-anchor:middle" o:gfxdata="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" fillcolor="white [3201]" strokeweight=".5pt">
+                    <v:textbox inset="0,1mm,0,1mm">
+                      <w:txbxContent>
+                        <w:p>
+                          <w:pPr>
+                            <w:spacing w:line="252" w:lineRule="auto"/>
+                            <w:jc w:val="center"/>
+                            <w:rPr>
+                              <w:rFonts w:ascii="Calibri" w:eastAsia="Calibri" w:hAnsi="Calibri"/>
+                              <w:b/>
+                              <w:bCs/>
+                              <w:shadow/>
+                              <w:color w:val="000000"/>
+                              <w14:shadow w14:blurRad="38100" w14:dist="19050" w14:dir="2700000" w14:sx="100000" w14:sy="100000" w14:kx="0" w14:ky="0" w14:algn="tl">
+                                <w14:schemeClr w14:val="dk1">
+                                  <w14:alpha w14:val="60000"/>
+                                </w14:schemeClr>
+                              </w14:shadow>
+                              <w14:ligatures w14:val="none"/>
+                            </w:rPr>
+                          </w:pPr>
+                          <w:r>
+                            <w:rPr>
+                              <w:rFonts w:ascii="Calibri" w:eastAsia="Calibri" w:hAnsi="Calibri"/>
+                              <w:b/>
+                              <w:bCs/>
+                              <w:shadow/>
+                              <w:color w:val="000000"/>
+                              <w14:shadow w14:blurRad="38100" w14:dist="19050" w14:dir="2700000" w14:sx="100000" w14:sy="100000" w14:kx="0" w14:ky="0" w14:algn="tl">
+                                <w14:schemeClr w14:val="dk1">
+                                  <w14:alpha w14:val="60000"/>
+                                </w14:schemeClr>
+                              </w14:shadow>
+                            </w:rPr>
+                            <w:t> </w:t>
+                          </w:r>
+                        </w:p>
+                      </w:txbxContent>
+                    </v:textbox>
+                  </v:shape>
+                  <v:shape id="Zone de texte 1" o:spid="_x0000_s1170" type="#_x0000_t202" style="position:absolute;left:8841;top:31332;width:1079;height:1078;visibility:visible;mso-wrap-style:square;v-text-anchor:middle" o:gfxdata="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" fillcolor="white [3201]" strokeweight=".5pt">
+                    <v:textbox inset="0,1mm,0,1mm">
+                      <w:txbxContent>
+                        <w:p>
+                          <w:pPr>
+                            <w:spacing w:line="252" w:lineRule="auto"/>
+                            <w:jc w:val="center"/>
+                            <w:rPr>
+                              <w:rFonts w:ascii="Calibri" w:eastAsia="Calibri" w:hAnsi="Calibri"/>
+                              <w:b/>
+                              <w:bCs/>
+                              <w:shadow/>
+                              <w:color w:val="000000"/>
+                              <w14:shadow w14:blurRad="38100" w14:dist="19050" w14:dir="2700000" w14:sx="100000" w14:sy="100000" w14:kx="0" w14:ky="0" w14:algn="tl">
+                                <w14:schemeClr w14:val="dk1">
+                                  <w14:alpha w14:val="60000"/>
+                                </w14:schemeClr>
+                              </w14:shadow>
+                              <w14:ligatures w14:val="none"/>
+                            </w:rPr>
+                          </w:pPr>
+                          <w:r>
+                            <w:rPr>
+                              <w:rFonts w:ascii="Calibri" w:eastAsia="Calibri" w:hAnsi="Calibri"/>
+                              <w:b/>
+                              <w:bCs/>
+                              <w:shadow/>
+                              <w:color w:val="000000"/>
+                              <w14:shadow w14:blurRad="38100" w14:dist="19050" w14:dir="2700000" w14:sx="100000" w14:sy="100000" w14:kx="0" w14:ky="0" w14:algn="tl">
+                                <w14:schemeClr w14:val="dk1">
+                                  <w14:alpha w14:val="60000"/>
+                                </w14:schemeClr>
+                              </w14:shadow>
+                            </w:rPr>
+                            <w:t> </w:t>
+                          </w:r>
+                        </w:p>
+                      </w:txbxContent>
+                    </v:textbox>
+                  </v:shape>
+                  <v:shape id="Zone de texte 1" o:spid="_x0000_s1171" type="#_x0000_t202" style="position:absolute;left:9913;top:31332;width:1079;height:1078;visibility:visible;mso-wrap-style:square;v-text-anchor:middle" o:gfxdata="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" fillcolor="white [3201]" strokeweight=".5pt">
+                    <v:textbox inset="0,1mm,0,1mm">
+                      <w:txbxContent>
+                        <w:p>
+                          <w:pPr>
+                            <w:spacing w:line="252" w:lineRule="auto"/>
+                            <w:jc w:val="center"/>
+                            <w:rPr>
+                              <w:rFonts w:ascii="Calibri" w:eastAsia="Calibri" w:hAnsi="Calibri"/>
+                              <w:b/>
+                              <w:bCs/>
+                              <w:shadow/>
+                              <w:color w:val="000000"/>
+                              <w14:shadow w14:blurRad="38100" w14:dist="19050" w14:dir="2700000" w14:sx="100000" w14:sy="100000" w14:kx="0" w14:ky="0" w14:algn="tl">
+                                <w14:schemeClr w14:val="dk1">
+                                  <w14:alpha w14:val="60000"/>
+                                </w14:schemeClr>
+                              </w14:shadow>
+                              <w14:ligatures w14:val="none"/>
+                            </w:rPr>
+                          </w:pPr>
+                          <w:r>
+                            <w:rPr>
+                              <w:rFonts w:ascii="Calibri" w:eastAsia="Calibri" w:hAnsi="Calibri"/>
+                              <w:b/>
+                              <w:bCs/>
+                              <w:shadow/>
+                              <w:color w:val="000000"/>
+                              <w14:shadow w14:blurRad="38100" w14:dist="19050" w14:dir="2700000" w14:sx="100000" w14:sy="100000" w14:kx="0" w14:ky="0" w14:algn="tl">
+                                <w14:schemeClr w14:val="dk1">
+                                  <w14:alpha w14:val="60000"/>
+                                </w14:schemeClr>
+                              </w14:shadow>
+                            </w:rPr>
+                            <w:t> </w:t>
+                          </w:r>
+                        </w:p>
+                      </w:txbxContent>
+                    </v:textbox>
+                  </v:shape>
+                  <v:shape id="Zone de texte 1" o:spid="_x0000_s1172" type="#_x0000_t202" style="position:absolute;left:10980;top:31332;width:1079;height:1078;visibility:visible;mso-wrap-style:square;v-text-anchor:middle" o:gfxdata="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" fillcolor="white [3201]" strokeweight=".5pt">
+                    <v:textbox inset="0,1mm,0,1mm">
+                      <w:txbxContent>
+                        <w:p>
+                          <w:pPr>
+                            <w:spacing w:line="252" w:lineRule="auto"/>
+                            <w:jc w:val="center"/>
+                            <w:rPr>
+                              <w:rFonts w:ascii="Calibri" w:eastAsia="Calibri" w:hAnsi="Calibri"/>
+                              <w:b/>
+                              <w:bCs/>
+                              <w:shadow/>
+                              <w:color w:val="000000"/>
+                              <w14:shadow w14:blurRad="38100" w14:dist="19050" w14:dir="2700000" w14:sx="100000" w14:sy="100000" w14:kx="0" w14:ky="0" w14:algn="tl">
+                                <w14:schemeClr w14:val="dk1">
+                                  <w14:alpha w14:val="60000"/>
+                                </w14:schemeClr>
+                              </w14:shadow>
+                              <w14:ligatures w14:val="none"/>
+                            </w:rPr>
+                          </w:pPr>
+                          <w:r>
+                            <w:rPr>
+                              <w:rFonts w:ascii="Calibri" w:eastAsia="Calibri" w:hAnsi="Calibri"/>
+                              <w:b/>
+                              <w:bCs/>
+                              <w:shadow/>
+                              <w:color w:val="000000"/>
+                              <w14:shadow w14:blurRad="38100" w14:dist="19050" w14:dir="2700000" w14:sx="100000" w14:sy="100000" w14:kx="0" w14:ky="0" w14:algn="tl">
+                                <w14:schemeClr w14:val="dk1">
+                                  <w14:alpha w14:val="60000"/>
+                                </w14:schemeClr>
+                              </w14:shadow>
+                            </w:rPr>
+                            <w:t> </w:t>
+                          </w:r>
+                        </w:p>
+                      </w:txbxContent>
+                    </v:textbox>
+                  </v:shape>
+                  <v:shape id="Zone de texte 1" o:spid="_x0000_s1173" type="#_x0000_t202" style="position:absolute;left:12053;top:31332;width:1079;height:1078;visibility:visible;mso-wrap-style:square;v-text-anchor:middle" o:gfxdata="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" fillcolor="white [3201]" strokeweight=".5pt">
+                    <v:textbox inset="0,1mm,0,1mm">
+                      <w:txbxContent>
+                        <w:p>
+                          <w:pPr>
+                            <w:spacing w:line="252" w:lineRule="auto"/>
+                            <w:jc w:val="center"/>
+                            <w:rPr>
+                              <w:rFonts w:ascii="Calibri" w:eastAsia="Calibri" w:hAnsi="Calibri"/>
+                              <w:b/>
+                              <w:bCs/>
+                              <w:shadow/>
+                              <w:color w:val="000000"/>
+                              <w14:shadow w14:blurRad="38100" w14:dist="19050" w14:dir="2700000" w14:sx="100000" w14:sy="100000" w14:kx="0" w14:ky="0" w14:algn="tl">
+                                <w14:schemeClr w14:val="dk1">
+                                  <w14:alpha w14:val="60000"/>
+                                </w14:schemeClr>
+                              </w14:shadow>
+                              <w14:ligatures w14:val="none"/>
+                            </w:rPr>
+                          </w:pPr>
+                          <w:r>
+                            <w:rPr>
+                              <w:rFonts w:ascii="Calibri" w:eastAsia="Calibri" w:hAnsi="Calibri"/>
+                              <w:b/>
+                              <w:bCs/>
+                              <w:shadow/>
+                              <w:color w:val="000000"/>
+                              <w14:shadow w14:blurRad="38100" w14:dist="19050" w14:dir="2700000" w14:sx="100000" w14:sy="100000" w14:kx="0" w14:ky="0" w14:algn="tl">
+                                <w14:schemeClr w14:val="dk1">
+                                  <w14:alpha w14:val="60000"/>
+                                </w14:schemeClr>
+                              </w14:shadow>
+                            </w:rPr>
+                            <w:t> </w:t>
+                          </w:r>
+                        </w:p>
+                      </w:txbxContent>
+                    </v:textbox>
+                  </v:shape>
+                  <v:shape id="Zone de texte 1" o:spid="_x0000_s1174" type="#_x0000_t202" style="position:absolute;left:8084;top:29232;width:1406;height:1525;visibility:visible;mso-wrap-style:square;v-text-anchor:middle" o:gfxdata="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" filled="f" strokecolor="black [3213]" strokeweight=".5pt">
+                    <v:textbox inset="0,0,0,0">
+                      <w:txbxContent>
+                        <w:p>
+                          <w:pPr>
+                            <w:spacing w:line="252" w:lineRule="auto"/>
+                            <w:jc w:val="center"/>
+                            <w:rPr>
+                              <w:rFonts w:ascii="Calibri" w:eastAsia="Calibri" w:hAnsi="Calibri"/>
+                              <w:b/>
+                              <w:bCs/>
+                              <w:shadow/>
+                              <w:color w:val="000000"/>
+                              <w:sz w:val="16"/>
+                              <w:szCs w:val="16"/>
+                              <w14:shadow w14:blurRad="38100" w14:dist="19050" w14:dir="2700000" w14:sx="100000" w14:sy="100000" w14:kx="0" w14:ky="0" w14:algn="tl">
+                                <w14:schemeClr w14:val="dk1">
+                                  <w14:alpha w14:val="60000"/>
+                                </w14:schemeClr>
+                              </w14:shadow>
+                              <w14:ligatures w14:val="none"/>
+                            </w:rPr>
+                          </w:pPr>
+                          <w:r>
+                            <w:rPr>
+                              <w:rFonts w:ascii="Calibri" w:eastAsia="Calibri" w:hAnsi="Calibri"/>
+                              <w:b/>
+                              <w:bCs/>
+                              <w:shadow/>
+                              <w:color w:val="000000"/>
+                              <w:sz w:val="16"/>
+                              <w:szCs w:val="16"/>
+                              <w14:shadow w14:blurRad="38100" w14:dist="19050" w14:dir="2700000" w14:sx="100000" w14:sy="100000" w14:kx="0" w14:ky="0" w14:algn="tl">
+                                <w14:schemeClr w14:val="dk1">
+                                  <w14:alpha w14:val="60000"/>
+                                </w14:schemeClr>
+                              </w14:shadow>
+                            </w:rPr>
+                            <w:t>C</w:t>
+                          </w:r>
+                        </w:p>
+                      </w:txbxContent>
+                    </v:textbox>
+                  </v:shape>
+                  <v:shape id="Connecteur droit avec flèche 1666186605" o:spid="_x0000_s1175" type="#_x0000_t32" style="position:absolute;left:6068;top:33094;width:5423;height:0;flip:x;visibility:visible;mso-wrap-style:square" o:connectortype="straight" o:gfxdata="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" strokecolor="black [3200]" strokeweight=".5pt">
+                    <v:stroke endarrow="block" joinstyle="miter"/>
+                  </v:shape>
+                  <v:shape id="Zone de texte 1" o:spid="_x0000_s1176" type="#_x0000_t202" style="position:absolute;left:4269;top:32333;width:1637;height:1750;visibility:visible;mso-wrap-style:square;v-text-anchor:middle" o:gfxdata="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" filled="f" stroked="f" strokeweight=".5pt">
+                    <v:textbox inset="0,0,0,0">
+                      <w:txbxContent>
+                        <w:p>
+                          <w:pPr>
+                            <w:spacing w:line="252" w:lineRule="auto"/>
+                            <w:jc w:val="center"/>
+                            <w:rPr>
+                              <w:rFonts w:ascii="Calibri" w:eastAsia="Calibri" w:hAnsi="Calibri"/>
+                              <w:shadow/>
+                              <w:color w:val="000000"/>
+                              <w:sz w:val="16"/>
+                              <w:szCs w:val="16"/>
+                              <w14:shadow w14:blurRad="38100" w14:dist="19050" w14:dir="2700000" w14:sx="100000" w14:sy="100000" w14:kx="0" w14:ky="0" w14:algn="tl">
+                                <w14:schemeClr w14:val="dk1">
+                                  <w14:alpha w14:val="60000"/>
+                                </w14:schemeClr>
+                              </w14:shadow>
+                              <w14:ligatures w14:val="none"/>
+                            </w:rPr>
+                          </w:pPr>
+                          <w:r>
+                            <w:rPr>
+                              <w:rFonts w:ascii="Calibri" w:eastAsia="Calibri" w:hAnsi="Calibri"/>
+                              <w:shadow/>
+                              <w:color w:val="000000"/>
+                              <w:sz w:val="16"/>
+                              <w:szCs w:val="16"/>
+                              <w14:shadow w14:blurRad="38100" w14:dist="19050" w14:dir="2700000" w14:sx="100000" w14:sy="100000" w14:kx="0" w14:ky="0" w14:algn="tl">
+                                <w14:schemeClr w14:val="dk1">
+                                  <w14:alpha w14:val="60000"/>
+                                </w14:schemeClr>
+                              </w14:shadow>
+                            </w:rPr>
+                            <w:t>b7</w:t>
+                          </w:r>
+                        </w:p>
+                      </w:txbxContent>
+                    </v:textbox>
+                  </v:shape>
+                  <v:shape id="Zone de texte 1" o:spid="_x0000_s1177" type="#_x0000_t202" style="position:absolute;left:11851;top:32276;width:1638;height:1751;visibility:visible;mso-wrap-style:square;v-text-anchor:middle" o:gfxdata="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" filled="f" stroked="f" strokeweight=".5pt">
+                    <v:textbox inset="0,0,0,0">
+                      <w:txbxContent>
+                        <w:p>
+                          <w:pPr>
+                            <w:spacing w:line="252" w:lineRule="auto"/>
+                            <w:jc w:val="center"/>
+                            <w:rPr>
+                              <w:rFonts w:ascii="Calibri" w:eastAsia="Calibri" w:hAnsi="Calibri"/>
+                              <w:shadow/>
+                              <w:color w:val="000000"/>
+                              <w:sz w:val="16"/>
+                              <w:szCs w:val="16"/>
+                              <w14:shadow w14:blurRad="38100" w14:dist="19050" w14:dir="2700000" w14:sx="100000" w14:sy="100000" w14:kx="0" w14:ky="0" w14:algn="tl">
+                                <w14:schemeClr w14:val="dk1">
+                                  <w14:alpha w14:val="60000"/>
+                                </w14:schemeClr>
+                              </w14:shadow>
+                              <w14:ligatures w14:val="none"/>
+                            </w:rPr>
+                          </w:pPr>
+                          <w:r>
+                            <w:rPr>
+                              <w:rFonts w:ascii="Calibri" w:eastAsia="Calibri" w:hAnsi="Calibri"/>
+                              <w:shadow/>
+                              <w:color w:val="000000"/>
+                              <w:sz w:val="16"/>
+                              <w:szCs w:val="16"/>
+                              <w14:shadow w14:blurRad="38100" w14:dist="19050" w14:dir="2700000" w14:sx="100000" w14:sy="100000" w14:kx="0" w14:ky="0" w14:algn="tl">
+                                <w14:schemeClr w14:val="dk1">
+                                  <w14:alpha w14:val="60000"/>
+                                </w14:schemeClr>
+                              </w14:shadow>
+                            </w:rPr>
+                            <w:t>b0</w:t>
+                          </w:r>
+                        </w:p>
+                      </w:txbxContent>
+                    </v:textbox>
+                  </v:shape>
+                  <v:shapetype id="_x0000_t34" coordsize="21600,21600" o:spt="34" o:oned="t" adj="10800" path="m,l@0,0@0,21600,21600,21600e" filled="f">
+                    <v:stroke joinstyle="miter"/>
+                    <v:formulas>
+                      <v:f eqn="val #0"/>
+                    </v:formulas>
+                    <v:path arrowok="t" fillok="f" o:connecttype="none"/>
+                    <v:handles>
+                      <v:h position="#0,center"/>
+                    </v:handles>
+                    <o:lock v:ext="edit" shapetype="t"/>
+                  </v:shapetype>
+                  <v:shape id="Connecteur : en angle 1950785009" o:spid="_x0000_s1178" type="#_x0000_t34" style="position:absolute;left:9490;top:29994;width:3642;height:1877;visibility:visible;mso-wrap-style:square" o:connectortype="elbow" o:gfxdata="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" adj="30228" strokecolor="black [3200]" strokeweight=".5pt">
+                    <v:stroke endarrow="block"/>
+                  </v:shape>
+                  <v:shape id="Connecteur : en angle 74693146" o:spid="_x0000_s1179" type="#_x0000_t34" style="position:absolute;left:4545;top:30029;width:3442;height:1842;rotation:180;flip:y;visibility:visible;mso-wrap-style:square" o:connectortype="elbow" o:gfxdata="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" adj="26599" strokecolor="black [3200]" strokeweight=".5pt"/>
+                </v:group>
+                <v:group id="Groupe 972796972" o:spid="_x0000_s1180" style="position:absolute;left:18667;top:29128;width:9221;height:4851" coordsize="9220,4851" o:gfxdata="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">
+                  <v:shape id="Zone de texte 1" o:spid="_x0000_s1181" type="#_x0000_t202" style="position:absolute;left:275;top:2100;width:1080;height:1078;visibility:visible;mso-wrap-style:square;v-text-anchor:middle" o:gfxdata="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" fillcolor="white [3201]" strokeweight=".5pt">
+                    <v:textbox inset="0,1mm,0,1mm">
+                      <w:txbxContent>
+                        <w:p>
+                          <w:pPr>
+                            <w:spacing w:line="252" w:lineRule="auto"/>
+                            <w:jc w:val="center"/>
+                            <w:rPr>
+                              <w:rFonts w:ascii="Calibri" w:eastAsia="Calibri" w:hAnsi="Calibri"/>
+                              <w:b/>
+                              <w:bCs/>
+                              <w:shadow/>
+                              <w:color w:val="000000"/>
+                              <w14:shadow w14:blurRad="38100" w14:dist="19050" w14:dir="2700000" w14:sx="100000" w14:sy="100000" w14:kx="0" w14:ky="0" w14:algn="tl">
+                                <w14:schemeClr w14:val="dk1">
+                                  <w14:alpha w14:val="60000"/>
+                                </w14:schemeClr>
+                              </w14:shadow>
+                              <w14:ligatures w14:val="none"/>
+                            </w:rPr>
+                          </w:pPr>
+                          <w:r>
+                            <w:rPr>
+                              <w:rFonts w:ascii="Calibri" w:eastAsia="Calibri" w:hAnsi="Calibri"/>
+                              <w:b/>
+                              <w:bCs/>
+                              <w:shadow/>
+                              <w:color w:val="000000"/>
+                              <w14:shadow w14:blurRad="38100" w14:dist="19050" w14:dir="2700000" w14:sx="100000" w14:sy="100000" w14:kx="0" w14:ky="0" w14:algn="tl">
+                                <w14:schemeClr w14:val="dk1">
+                                  <w14:alpha w14:val="60000"/>
+                                </w14:schemeClr>
+                              </w14:shadow>
+                            </w:rPr>
+                            <w:t> </w:t>
+                          </w:r>
+                        </w:p>
+                      </w:txbxContent>
+                    </v:textbox>
+                  </v:shape>
+                  <v:shape id="Zone de texte 1" o:spid="_x0000_s1182" type="#_x0000_t202" style="position:absolute;left:1347;top:2100;width:1080;height:1078;visibility:visible;mso-wrap-style:square;v-text-anchor:middle" o:gfxdata="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" fillcolor="white [3201]" strokeweight=".5pt">
+                    <v:textbox inset="0,1mm,0,1mm">
+                      <w:txbxContent>
+                        <w:p>
+                          <w:pPr>
+                            <w:spacing w:line="252" w:lineRule="auto"/>
+                            <w:jc w:val="center"/>
+                            <w:rPr>
+                              <w:rFonts w:ascii="Calibri" w:eastAsia="Calibri" w:hAnsi="Calibri"/>
+                              <w:b/>
+                              <w:bCs/>
+                              <w:shadow/>
+                              <w:color w:val="000000"/>
+                              <w14:shadow w14:blurRad="38100" w14:dist="19050" w14:dir="2700000" w14:sx="100000" w14:sy="100000" w14:kx="0" w14:ky="0" w14:algn="tl">
+                                <w14:schemeClr w14:val="dk1">
+                                  <w14:alpha w14:val="60000"/>
+                                </w14:schemeClr>
+                              </w14:shadow>
+                              <w14:ligatures w14:val="none"/>
+                            </w:rPr>
+                          </w:pPr>
+                          <w:r>
+                            <w:rPr>
+                              <w:rFonts w:ascii="Calibri" w:eastAsia="Calibri" w:hAnsi="Calibri"/>
+                              <w:b/>
+                              <w:bCs/>
+                              <w:shadow/>
+                              <w:color w:val="000000"/>
+                              <w14:shadow w14:blurRad="38100" w14:dist="19050" w14:dir="2700000" w14:sx="100000" w14:sy="100000" w14:kx="0" w14:ky="0" w14:algn="tl">
+                                <w14:schemeClr w14:val="dk1">
+                                  <w14:alpha w14:val="60000"/>
+                                </w14:schemeClr>
+                              </w14:shadow>
+                            </w:rPr>
+                            <w:t> </w:t>
+                          </w:r>
+                        </w:p>
+                      </w:txbxContent>
+                    </v:textbox>
+                  </v:shape>
+                  <v:shape id="Zone de texte 1" o:spid="_x0000_s1183" type="#_x0000_t202" style="position:absolute;left:2420;top:2100;width:1079;height:1078;visibility:visible;mso-wrap-style:square;v-text-anchor:middle" o:gfxdata="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" fillcolor="white [3201]" strokeweight=".5pt">
+                    <v:textbox inset="0,1mm,0,1mm">
+                      <w:txbxContent>
+                        <w:p>
+                          <w:pPr>
+                            <w:spacing w:line="252" w:lineRule="auto"/>
+                            <w:jc w:val="center"/>
+                            <w:rPr>
+                              <w:rFonts w:ascii="Calibri" w:eastAsia="Calibri" w:hAnsi="Calibri"/>
+                              <w:b/>
+                              <w:bCs/>
+                              <w:shadow/>
+                              <w:color w:val="000000"/>
+                              <w14:shadow w14:blurRad="38100" w14:dist="19050" w14:dir="2700000" w14:sx="100000" w14:sy="100000" w14:kx="0" w14:ky="0" w14:algn="tl">
+                                <w14:schemeClr w14:val="dk1">
+                                  <w14:alpha w14:val="60000"/>
+                                </w14:schemeClr>
+                              </w14:shadow>
+                              <w14:ligatures w14:val="none"/>
+                            </w:rPr>
+                          </w:pPr>
+                          <w:r>
+                            <w:rPr>
+                              <w:rFonts w:ascii="Calibri" w:eastAsia="Calibri" w:hAnsi="Calibri"/>
+                              <w:b/>
+                              <w:bCs/>
+                              <w:shadow/>
+                              <w:color w:val="000000"/>
+                              <w14:shadow w14:blurRad="38100" w14:dist="19050" w14:dir="2700000" w14:sx="100000" w14:sy="100000" w14:kx="0" w14:ky="0" w14:algn="tl">
+                                <w14:schemeClr w14:val="dk1">
+                                  <w14:alpha w14:val="60000"/>
+                                </w14:schemeClr>
+                              </w14:shadow>
+                            </w:rPr>
+                            <w:t> </w:t>
+                          </w:r>
+                        </w:p>
+                      </w:txbxContent>
+                    </v:textbox>
+                  </v:shape>
+                  <v:shape id="Zone de texte 1" o:spid="_x0000_s1184" type="#_x0000_t202" style="position:absolute;left:3492;top:2100;width:1079;height:1078;visibility:visible;mso-wrap-style:square;v-text-anchor:middle" o:gfxdata="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" fillcolor="white [3201]" strokeweight=".5pt">
+                    <v:textbox inset="0,1mm,0,1mm">
+                      <w:txbxContent>
+                        <w:p>
+                          <w:pPr>
+                            <w:spacing w:line="252" w:lineRule="auto"/>
+                            <w:jc w:val="center"/>
+                            <w:rPr>
+                              <w:rFonts w:ascii="Calibri" w:eastAsia="Calibri" w:hAnsi="Calibri"/>
+                              <w:b/>
+                              <w:bCs/>
+                              <w:shadow/>
+                              <w:color w:val="000000"/>
+                              <w14:shadow w14:blurRad="38100" w14:dist="19050" w14:dir="2700000" w14:sx="100000" w14:sy="100000" w14:kx="0" w14:ky="0" w14:algn="tl">
+                                <w14:schemeClr w14:val="dk1">
+                                  <w14:alpha w14:val="60000"/>
+                                </w14:schemeClr>
+                              </w14:shadow>
+                              <w14:ligatures w14:val="none"/>
+                            </w:rPr>
+                          </w:pPr>
+                          <w:r>
+                            <w:rPr>
+                              <w:rFonts w:ascii="Calibri" w:eastAsia="Calibri" w:hAnsi="Calibri"/>
+                              <w:b/>
+                              <w:bCs/>
+                              <w:shadow/>
+                              <w:color w:val="000000"/>
+                              <w14:shadow w14:blurRad="38100" w14:dist="19050" w14:dir="2700000" w14:sx="100000" w14:sy="100000" w14:kx="0" w14:ky="0" w14:algn="tl">
+                                <w14:schemeClr w14:val="dk1">
+                                  <w14:alpha w14:val="60000"/>
+                                </w14:schemeClr>
+                              </w14:shadow>
+                            </w:rPr>
+                            <w:t> </w:t>
+                          </w:r>
+                        </w:p>
+                      </w:txbxContent>
+                    </v:textbox>
+                  </v:shape>
+                  <v:shape id="Zone de texte 1" o:spid="_x0000_s1185" type="#_x0000_t202" style="position:absolute;left:4571;top:2100;width:1080;height:1078;visibility:visible;mso-wrap-style:square;v-text-anchor:middle" o:gfxdata="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" fillcolor="white [3201]" strokeweight=".5pt">
+                    <v:textbox inset="0,1mm,0,1mm">
+                      <w:txbxContent>
+                        <w:p>
+                          <w:pPr>
+                            <w:spacing w:line="252" w:lineRule="auto"/>
+                            <w:jc w:val="center"/>
+                            <w:rPr>
+                              <w:rFonts w:ascii="Calibri" w:eastAsia="Calibri" w:hAnsi="Calibri"/>
+                              <w:b/>
+                              <w:bCs/>
+                              <w:shadow/>
+                              <w:color w:val="000000"/>
+                              <w14:shadow w14:blurRad="38100" w14:dist="19050" w14:dir="2700000" w14:sx="100000" w14:sy="100000" w14:kx="0" w14:ky="0" w14:algn="tl">
+                                <w14:schemeClr w14:val="dk1">
+                                  <w14:alpha w14:val="60000"/>
+                                </w14:schemeClr>
+                              </w14:shadow>
+                              <w14:ligatures w14:val="none"/>
+                            </w:rPr>
+                          </w:pPr>
+                          <w:r>
+                            <w:rPr>
+                              <w:rFonts w:ascii="Calibri" w:eastAsia="Calibri" w:hAnsi="Calibri"/>
+                              <w:b/>
+                              <w:bCs/>
+                              <w:shadow/>
+                              <w:color w:val="000000"/>
+                              <w14:shadow w14:blurRad="38100" w14:dist="19050" w14:dir="2700000" w14:sx="100000" w14:sy="100000" w14:kx="0" w14:ky="0" w14:algn="tl">
+                                <w14:schemeClr w14:val="dk1">
+                                  <w14:alpha w14:val="60000"/>
+                                </w14:schemeClr>
+                              </w14:shadow>
+                            </w:rPr>
+                            <w:t> </w:t>
+                          </w:r>
+                        </w:p>
+                      </w:txbxContent>
+                    </v:textbox>
+                  </v:shape>
+                  <v:shape id="Zone de texte 1" o:spid="_x0000_s1186" type="#_x0000_t202" style="position:absolute;left:5644;top:2100;width:1079;height:1078;visibility:visible;mso-wrap-style:square;v-text-anchor:middle" o:gfxdata="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" fillcolor="white [3201]" strokeweight=".5pt">
+                    <v:textbox inset="0,1mm,0,1mm">
+                      <w:txbxContent>
+                        <w:p>
+                          <w:pPr>
+                            <w:spacing w:line="252" w:lineRule="auto"/>
+                            <w:jc w:val="center"/>
+                            <w:rPr>
+                              <w:rFonts w:ascii="Calibri" w:eastAsia="Calibri" w:hAnsi="Calibri"/>
+                              <w:b/>
+                              <w:bCs/>
+                              <w:shadow/>
+                              <w:color w:val="000000"/>
+                              <w14:shadow w14:blurRad="38100" w14:dist="19050" w14:dir="2700000" w14:sx="100000" w14:sy="100000" w14:kx="0" w14:ky="0" w14:algn="tl">
+                                <w14:schemeClr w14:val="dk1">
+                                  <w14:alpha w14:val="60000"/>
+                                </w14:schemeClr>
+                              </w14:shadow>
+                              <w14:ligatures w14:val="none"/>
+                            </w:rPr>
+                          </w:pPr>
+                          <w:r>
+                            <w:rPr>
+                              <w:rFonts w:ascii="Calibri" w:eastAsia="Calibri" w:hAnsi="Calibri"/>
+                              <w:b/>
+                              <w:bCs/>
+                              <w:shadow/>
+                              <w:color w:val="000000"/>
+                              <w14:shadow w14:blurRad="38100" w14:dist="19050" w14:dir="2700000" w14:sx="100000" w14:sy="100000" w14:kx="0" w14:ky="0" w14:algn="tl">
+                                <w14:schemeClr w14:val="dk1">
+                                  <w14:alpha w14:val="60000"/>
+                                </w14:schemeClr>
+                              </w14:shadow>
+                            </w:rPr>
+                            <w:t> </w:t>
+                          </w:r>
+                        </w:p>
+                      </w:txbxContent>
+                    </v:textbox>
+                  </v:shape>
+                  <v:shape id="Zone de texte 1" o:spid="_x0000_s1187" type="#_x0000_t202" style="position:absolute;left:6711;top:2100;width:1079;height:1078;visibility:visible;mso-wrap-style:square;v-text-anchor:middle" o:gfxdata="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" fillcolor="white [3201]" strokeweight=".5pt">
+                    <v:textbox inset="0,1mm,0,1mm">
+                      <w:txbxContent>
+                        <w:p>
+                          <w:pPr>
+                            <w:spacing w:line="252" w:lineRule="auto"/>
+                            <w:jc w:val="center"/>
+                            <w:rPr>
+                              <w:rFonts w:ascii="Calibri" w:eastAsia="Calibri" w:hAnsi="Calibri"/>
+                              <w:b/>
+                              <w:bCs/>
+                              <w:shadow/>
+                              <w:color w:val="000000"/>
+                              <w14:shadow w14:blurRad="38100" w14:dist="19050" w14:dir="2700000" w14:sx="100000" w14:sy="100000" w14:kx="0" w14:ky="0" w14:algn="tl">
+                                <w14:schemeClr w14:val="dk1">
+                                  <w14:alpha w14:val="60000"/>
+                                </w14:schemeClr>
+                              </w14:shadow>
+                              <w14:ligatures w14:val="none"/>
+                            </w:rPr>
+                          </w:pPr>
+                          <w:r>
+                            <w:rPr>
+                              <w:rFonts w:ascii="Calibri" w:eastAsia="Calibri" w:hAnsi="Calibri"/>
+                              <w:b/>
+                              <w:bCs/>
+                              <w:shadow/>
+                              <w:color w:val="000000"/>
+                              <w14:shadow w14:blurRad="38100" w14:dist="19050" w14:dir="2700000" w14:sx="100000" w14:sy="100000" w14:kx="0" w14:ky="0" w14:algn="tl">
+                                <w14:schemeClr w14:val="dk1">
+                                  <w14:alpha w14:val="60000"/>
+                                </w14:schemeClr>
+                              </w14:shadow>
+                            </w:rPr>
+                            <w:t> </w:t>
+                          </w:r>
+                        </w:p>
+                      </w:txbxContent>
+                    </v:textbox>
+                  </v:shape>
+                  <v:shape id="Zone de texte 1" o:spid="_x0000_s1188" type="#_x0000_t202" style="position:absolute;left:7783;top:2100;width:1080;height:1078;visibility:visible;mso-wrap-style:square;v-text-anchor:middle" o:gfxdata="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" fillcolor="white [3201]" strokeweight=".5pt">
+                    <v:textbox inset="0,1mm,0,1mm">
+                      <w:txbxContent>
+                        <w:p>
+                          <w:pPr>
+                            <w:spacing w:line="252" w:lineRule="auto"/>
+                            <w:jc w:val="center"/>
+                            <w:rPr>
+                              <w:rFonts w:ascii="Calibri" w:eastAsia="Calibri" w:hAnsi="Calibri"/>
+                              <w:b/>
+                              <w:bCs/>
+                              <w:shadow/>
+                              <w:color w:val="000000"/>
+                              <w14:shadow w14:blurRad="38100" w14:dist="19050" w14:dir="2700000" w14:sx="100000" w14:sy="100000" w14:kx="0" w14:ky="0" w14:algn="tl">
+                                <w14:schemeClr w14:val="dk1">
+                                  <w14:alpha w14:val="60000"/>
+                                </w14:schemeClr>
+                              </w14:shadow>
+                              <w14:ligatures w14:val="none"/>
+                            </w:rPr>
+                          </w:pPr>
+                          <w:r>
+                            <w:rPr>
+                              <w:rFonts w:ascii="Calibri" w:eastAsia="Calibri" w:hAnsi="Calibri"/>
+                              <w:b/>
+                              <w:bCs/>
+                              <w:shadow/>
+                              <w:color w:val="000000"/>
+                              <w14:shadow w14:blurRad="38100" w14:dist="19050" w14:dir="2700000" w14:sx="100000" w14:sy="100000" w14:kx="0" w14:ky="0" w14:algn="tl">
+                                <w14:schemeClr w14:val="dk1">
+                                  <w14:alpha w14:val="60000"/>
+                                </w14:schemeClr>
+                              </w14:shadow>
+                            </w:rPr>
+                            <w:t> </w:t>
+                          </w:r>
+                        </w:p>
+                      </w:txbxContent>
+                    </v:textbox>
+                  </v:shape>
+                  <v:shape id="Zone de texte 1" o:spid="_x0000_s1189" type="#_x0000_t202" style="position:absolute;left:3815;width:1406;height:1525;visibility:visible;mso-wrap-style:square;v-text-anchor:middle" o:gfxdata="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" filled="f" strokecolor="black [3213]" strokeweight=".5pt">
+                    <v:textbox inset="0,0,0,0">
+                      <w:txbxContent>
+                        <w:p>
+                          <w:pPr>
+                            <w:spacing w:line="252" w:lineRule="auto"/>
+                            <w:jc w:val="center"/>
+                            <w:rPr>
+                              <w:rFonts w:ascii="Calibri" w:eastAsia="Calibri" w:hAnsi="Calibri"/>
+                              <w:b/>
+                              <w:bCs/>
+                              <w:shadow/>
+                              <w:color w:val="000000"/>
+                              <w:sz w:val="16"/>
+                              <w:szCs w:val="16"/>
+                              <w14:shadow w14:blurRad="38100" w14:dist="19050" w14:dir="2700000" w14:sx="100000" w14:sy="100000" w14:kx="0" w14:ky="0" w14:algn="tl">
+                                <w14:schemeClr w14:val="dk1">
+                                  <w14:alpha w14:val="60000"/>
+                                </w14:schemeClr>
+                              </w14:shadow>
+                              <w14:ligatures w14:val="none"/>
+                            </w:rPr>
+                          </w:pPr>
+                          <w:r>
+                            <w:rPr>
+                              <w:rFonts w:ascii="Calibri" w:eastAsia="Calibri" w:hAnsi="Calibri"/>
+                              <w:b/>
+                              <w:bCs/>
+                              <w:shadow/>
+                              <w:color w:val="000000"/>
+                              <w:sz w:val="16"/>
+                              <w:szCs w:val="16"/>
+                              <w14:shadow w14:blurRad="38100" w14:dist="19050" w14:dir="2700000" w14:sx="100000" w14:sy="100000" w14:kx="0" w14:ky="0" w14:algn="tl">
+                                <w14:schemeClr w14:val="dk1">
+                                  <w14:alpha w14:val="60000"/>
+                                </w14:schemeClr>
+                              </w14:shadow>
+                            </w:rPr>
+                            <w:t>C</w:t>
+                          </w:r>
+                        </w:p>
+                      </w:txbxContent>
+                    </v:textbox>
+                  </v:shape>
+                  <v:shape id="Connecteur droit avec flèche 571364796" o:spid="_x0000_s1190" type="#_x0000_t32" style="position:absolute;left:1799;top:3862;width:5423;height:0;flip:x;visibility:visible;mso-wrap-style:square" o:connectortype="straight" o:gfxdata="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" strokecolor="black [3200]" strokeweight=".5pt">
+                    <v:stroke startarrow="block" joinstyle="miter"/>
+                  </v:shape>
+                  <v:shape id="Zone de texte 1" o:spid="_x0000_s1191" type="#_x0000_t202" style="position:absolute;top:3101;width:1637;height:1750;visibility:visible;mso-wrap-style:square;v-text-anchor:middle" o:gfxdata="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" filled="f" stroked="f" strokeweight=".5pt">
+                    <v:textbox inset="0,0,0,0">
+                      <w:txbxContent>
+                        <w:p>
+                          <w:pPr>
+                            <w:spacing w:line="252" w:lineRule="auto"/>
+                            <w:jc w:val="center"/>
+                            <w:rPr>
+                              <w:rFonts w:ascii="Calibri" w:eastAsia="Calibri" w:hAnsi="Calibri"/>
+                              <w:shadow/>
+                              <w:color w:val="000000"/>
+                              <w:sz w:val="16"/>
+                              <w:szCs w:val="16"/>
+                              <w14:shadow w14:blurRad="38100" w14:dist="19050" w14:dir="2700000" w14:sx="100000" w14:sy="100000" w14:kx="0" w14:ky="0" w14:algn="tl">
+                                <w14:schemeClr w14:val="dk1">
+                                  <w14:alpha w14:val="60000"/>
+                                </w14:schemeClr>
+                              </w14:shadow>
+                              <w14:ligatures w14:val="none"/>
+                            </w:rPr>
+                          </w:pPr>
+                          <w:r>
+                            <w:rPr>
+                              <w:rFonts w:ascii="Calibri" w:eastAsia="Calibri" w:hAnsi="Calibri"/>
+                              <w:shadow/>
+                              <w:color w:val="000000"/>
+                              <w:sz w:val="16"/>
+                              <w:szCs w:val="16"/>
+                              <w14:shadow w14:blurRad="38100" w14:dist="19050" w14:dir="2700000" w14:sx="100000" w14:sy="100000" w14:kx="0" w14:ky="0" w14:algn="tl">
+                                <w14:schemeClr w14:val="dk1">
+                                  <w14:alpha w14:val="60000"/>
+                                </w14:schemeClr>
+                              </w14:shadow>
+                            </w:rPr>
+                            <w:t>b7</w:t>
+                          </w:r>
+                        </w:p>
+                      </w:txbxContent>
+                    </v:textbox>
+                  </v:shape>
+                  <v:shape id="Zone de texte 1" o:spid="_x0000_s1192" type="#_x0000_t202" style="position:absolute;left:7582;top:3044;width:1638;height:1751;visibility:visible;mso-wrap-style:square;v-text-anchor:middle" o:gfxdata="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" filled="f" stroked="f" strokeweight=".5pt">
+                    <v:textbox inset="0,0,0,0">
+                      <w:txbxContent>
+                        <w:p>
+                          <w:pPr>
+                            <w:spacing w:line="252" w:lineRule="auto"/>
+                            <w:jc w:val="center"/>
+                            <w:rPr>
+                              <w:rFonts w:ascii="Calibri" w:eastAsia="Calibri" w:hAnsi="Calibri"/>
+                              <w:shadow/>
+                              <w:color w:val="000000"/>
+                              <w:sz w:val="16"/>
+                              <w:szCs w:val="16"/>
+                              <w14:shadow w14:blurRad="38100" w14:dist="19050" w14:dir="2700000" w14:sx="100000" w14:sy="100000" w14:kx="0" w14:ky="0" w14:algn="tl">
+                                <w14:schemeClr w14:val="dk1">
+                                  <w14:alpha w14:val="60000"/>
+                                </w14:schemeClr>
+                              </w14:shadow>
+                              <w14:ligatures w14:val="none"/>
+                            </w:rPr>
+                          </w:pPr>
+                          <w:r>
+                            <w:rPr>
+                              <w:rFonts w:ascii="Calibri" w:eastAsia="Calibri" w:hAnsi="Calibri"/>
+                              <w:shadow/>
+                              <w:color w:val="000000"/>
+                              <w:sz w:val="16"/>
+                              <w:szCs w:val="16"/>
+                              <w14:shadow w14:blurRad="38100" w14:dist="19050" w14:dir="2700000" w14:sx="100000" w14:sy="100000" w14:kx="0" w14:ky="0" w14:algn="tl">
+                                <w14:schemeClr w14:val="dk1">
+                                  <w14:alpha w14:val="60000"/>
+                                </w14:schemeClr>
+                              </w14:shadow>
+                            </w:rPr>
+                            <w:t>b0</w:t>
+                          </w:r>
+                        </w:p>
+                      </w:txbxContent>
+                    </v:textbox>
+                  </v:shape>
+                  <v:shape id="Connecteur : en angle 575741132" o:spid="_x0000_s1193" type="#_x0000_t34" style="position:absolute;left:5221;top:762;width:3642;height:1877;visibility:visible;mso-wrap-style:square" o:connectortype="elbow" o:gfxdata="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" adj="30228" strokecolor="black [3200]" strokeweight=".5pt"/>
+                  <v:shape id="Connecteur : en angle 14753419" o:spid="_x0000_s1194" type="#_x0000_t34" style="position:absolute;left:275;top:797;width:3442;height:1842;rotation:180;flip:y;visibility:visible;mso-wrap-style:square" o:connectortype="elbow" o:gfxdata="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" adj="31164" strokecolor="black [3200]" strokeweight=".5pt">
+                    <v:stroke endarrow="block"/>
                   </v:shape>
                 </v:group>
                 <w10:anchorlock/>

</xml_diff>